<commit_message>
Addition of week 3 work on the logbook
</commit_message>
<xml_diff>
--- a/LOGBOOK.docx
+++ b/LOGBOOK.docx
@@ -252,6 +252,14 @@
     </w:p>
     <w:sdt>
       <w:sdtPr>
+        <w:rPr>
+          <w:rFonts w:asciiTheme="minorHAnsi" w:eastAsiaTheme="minorHAnsi" w:hAnsiTheme="minorHAnsi" w:cstheme="minorBidi"/>
+          <w:color w:val="auto"/>
+          <w:kern w:val="2"/>
+          <w:sz w:val="24"/>
+          <w:szCs w:val="24"/>
+          <w14:ligatures w14:val="standardContextual"/>
+        </w:rPr>
         <w:id w:val="887233833"/>
         <w:docPartObj>
           <w:docPartGallery w:val="Table of Contents"/>
@@ -260,15 +268,9 @@
       </w:sdtPr>
       <w:sdtEndPr>
         <w:rPr>
-          <w:rFonts w:asciiTheme="minorHAnsi" w:eastAsiaTheme="minorHAnsi" w:hAnsiTheme="minorHAnsi" w:cstheme="minorBidi"/>
           <w:b/>
           <w:bCs/>
           <w:noProof/>
-          <w:color w:val="auto"/>
-          <w:kern w:val="2"/>
-          <w:sz w:val="24"/>
-          <w:szCs w:val="24"/>
-          <w14:ligatures w14:val="standardContextual"/>
         </w:rPr>
       </w:sdtEndPr>
       <w:sdtContent>
@@ -279,8 +281,6 @@
           <w:r>
             <w:t>Contents</w:t>
           </w:r>
-          <w:bookmarkStart w:id="0" w:name="_GoBack"/>
-          <w:bookmarkEnd w:id="0"/>
         </w:p>
         <w:p>
           <w:pPr>
@@ -1459,7 +1459,7 @@
           <w:lang w:val="en-GB"/>
         </w:rPr>
       </w:pPr>
-      <w:bookmarkStart w:id="1" w:name="_Toc232049296"/>
+      <w:bookmarkStart w:id="0" w:name="_Toc232049296"/>
       <w:r>
         <w:rPr>
           <w:lang w:val="en-GB"/>
@@ -1467,23 +1467,23 @@
         <w:lastRenderedPageBreak/>
         <w:t>WEEK 1 CHECKLIST</w:t>
       </w:r>
+      <w:bookmarkEnd w:id="0"/>
+    </w:p>
+    <w:p>
+      <w:pPr>
+        <w:pStyle w:val="Heading2"/>
+        <w:rPr>
+          <w:lang w:val="en-GB"/>
+        </w:rPr>
+      </w:pPr>
+      <w:bookmarkStart w:id="1" w:name="_Toc232049297"/>
+      <w:r>
+        <w:rPr>
+          <w:lang w:val="en-GB"/>
+        </w:rPr>
+        <w:t>Fig 1.1</w:t>
+      </w:r>
       <w:bookmarkEnd w:id="1"/>
-    </w:p>
-    <w:p>
-      <w:pPr>
-        <w:pStyle w:val="Heading2"/>
-        <w:rPr>
-          <w:lang w:val="en-GB"/>
-        </w:rPr>
-      </w:pPr>
-      <w:bookmarkStart w:id="2" w:name="_Toc232049297"/>
-      <w:r>
-        <w:rPr>
-          <w:lang w:val="en-GB"/>
-        </w:rPr>
-        <w:t>Fig 1.1</w:t>
-      </w:r>
-      <w:bookmarkEnd w:id="2"/>
       <w:r>
         <w:rPr>
           <w:lang w:val="en-GB"/>
@@ -1605,14 +1605,14 @@
           <w:lang w:val="en-GB"/>
         </w:rPr>
       </w:pPr>
-      <w:bookmarkStart w:id="3" w:name="_Toc232049298"/>
+      <w:bookmarkStart w:id="2" w:name="_Toc232049298"/>
       <w:r>
         <w:rPr>
           <w:lang w:val="en-GB"/>
         </w:rPr>
         <w:t>Fig 1.2:</w:t>
       </w:r>
-      <w:bookmarkEnd w:id="3"/>
+      <w:bookmarkEnd w:id="2"/>
       <w:r>
         <w:rPr>
           <w:lang w:val="en-GB"/>
@@ -1725,11 +1725,11 @@
       <w:pPr>
         <w:pStyle w:val="Heading2"/>
       </w:pPr>
-      <w:bookmarkStart w:id="4" w:name="_Toc232049299"/>
+      <w:bookmarkStart w:id="3" w:name="_Toc232049299"/>
       <w:r>
         <w:t>Fig 1.3</w:t>
       </w:r>
-      <w:bookmarkEnd w:id="4"/>
+      <w:bookmarkEnd w:id="3"/>
     </w:p>
     <w:p>
       <w:r>
@@ -1855,12 +1855,12 @@
       <w:pPr>
         <w:pStyle w:val="Heading2"/>
       </w:pPr>
-      <w:bookmarkStart w:id="5" w:name="_Toc232049300"/>
+      <w:bookmarkStart w:id="4" w:name="_Toc232049300"/>
       <w:r>
         <w:lastRenderedPageBreak/>
         <w:t>Fig 1.4</w:t>
       </w:r>
-      <w:bookmarkEnd w:id="5"/>
+      <w:bookmarkEnd w:id="4"/>
     </w:p>
     <w:p>
       <w:proofErr w:type="spellStart"/>
@@ -1979,11 +1979,11 @@
       <w:pPr>
         <w:pStyle w:val="Heading2"/>
       </w:pPr>
-      <w:bookmarkStart w:id="6" w:name="_Toc232049301"/>
+      <w:bookmarkStart w:id="5" w:name="_Toc232049301"/>
       <w:r>
         <w:t>Fig 1.5</w:t>
       </w:r>
-      <w:bookmarkEnd w:id="6"/>
+      <w:bookmarkEnd w:id="5"/>
     </w:p>
     <w:p>
       <w:r>
@@ -2101,11 +2101,11 @@
       <w:pPr>
         <w:pStyle w:val="Heading2"/>
       </w:pPr>
-      <w:bookmarkStart w:id="7" w:name="_Toc232049302"/>
+      <w:bookmarkStart w:id="6" w:name="_Toc232049302"/>
       <w:r>
         <w:t>Fig 1.6</w:t>
       </w:r>
-      <w:bookmarkEnd w:id="7"/>
+      <w:bookmarkEnd w:id="6"/>
     </w:p>
     <w:p>
       <w:r>
@@ -2188,7 +2188,7 @@
           <w:lang w:val="en-GB"/>
         </w:rPr>
       </w:pPr>
-      <w:bookmarkStart w:id="8" w:name="_Toc232049303"/>
+      <w:bookmarkStart w:id="7" w:name="_Toc232049303"/>
       <w:r>
         <w:rPr>
           <w:lang w:val="en-GB"/>
@@ -2196,63 +2196,63 @@
         <w:lastRenderedPageBreak/>
         <w:t>Week 1 Student Reflection</w:t>
       </w:r>
+      <w:bookmarkEnd w:id="7"/>
+    </w:p>
+    <w:p>
+      <w:r>
+        <w:t xml:space="preserve">I installed XAMPP </w:t>
+      </w:r>
+      <w:r>
+        <w:t>on Windows 11 to create a local web development environment for the Wan Shoes inventory system. Fig 1.1 shows Apache and MySQL services running without port conflicts, which is essential for PHP processing and database connectivity. Fig 1.3 demonstrates successful PHP execution where a simple echo statement rendered "Hello World" in the browser, confirming the server properly parses PHP code. Fig 1.4 displays </w:t>
+      </w:r>
+      <w:proofErr w:type="spellStart"/>
+      <w:r>
+        <w:t>wan_shoes_db</w:t>
+      </w:r>
+      <w:proofErr w:type="spellEnd"/>
+      <w:r>
+        <w:t xml:space="preserve"> created in </w:t>
+      </w:r>
+      <w:proofErr w:type="spellStart"/>
+      <w:r>
+        <w:t>phpMyAdmin</w:t>
+      </w:r>
+      <w:proofErr w:type="spellEnd"/>
+      <w:r>
+        <w:t xml:space="preserve"> with five relational tables: admins, employees, products, sales, and </w:t>
+      </w:r>
+      <w:proofErr w:type="spellStart"/>
+      <w:r>
+        <w:t>stock_records</w:t>
+      </w:r>
+      <w:proofErr w:type="spellEnd"/>
+      <w:r>
+        <w:t>. The folder structure in Fig 1.5 follows MVC-inspired organization with separate directories for CSS, JavaScript, and feature modules. Finally, Fig 1.6 shows the GitHub repository containing all project code, fulfilling the version control requirement. XAMPP provides a stable foundation for developing the complete inventory management system.</w:t>
+      </w:r>
+    </w:p>
+    <w:p/>
+    <w:p>
+      <w:pPr>
+        <w:pStyle w:val="Heading1"/>
+      </w:pPr>
+      <w:bookmarkStart w:id="8" w:name="_Toc232049304"/>
+      <w:r>
+        <w:t>WEEK 2</w:t>
+      </w:r>
       <w:bookmarkEnd w:id="8"/>
-    </w:p>
-    <w:p>
-      <w:r>
-        <w:t xml:space="preserve">I installed XAMPP </w:t>
-      </w:r>
-      <w:r>
-        <w:t>on Windows 11 to create a local web development environment for the Wan Shoes inventory system. Fig 1.1 shows Apache and MySQL services running without port conflicts, which is essential for PHP processing and database connectivity. Fig 1.3 demonstrates successful PHP execution where a simple echo statement rendered "Hello World" in the browser, confirming the server properly parses PHP code. Fig 1.4 displays </w:t>
-      </w:r>
-      <w:proofErr w:type="spellStart"/>
-      <w:r>
-        <w:t>wan_shoes_db</w:t>
-      </w:r>
-      <w:proofErr w:type="spellEnd"/>
-      <w:r>
-        <w:t xml:space="preserve"> created in </w:t>
-      </w:r>
-      <w:proofErr w:type="spellStart"/>
-      <w:r>
-        <w:t>phpMyAdmin</w:t>
-      </w:r>
-      <w:proofErr w:type="spellEnd"/>
-      <w:r>
-        <w:t xml:space="preserve"> with five relational tables: admins, employees, products, sales, and </w:t>
-      </w:r>
-      <w:proofErr w:type="spellStart"/>
-      <w:r>
-        <w:t>stock_records</w:t>
-      </w:r>
-      <w:proofErr w:type="spellEnd"/>
-      <w:r>
-        <w:t>. The folder structure in Fig 1.5 follows MVC-inspired organization with separate directories for CSS, JavaScript, and feature modules. Finally, Fig 1.6 shows the GitHub repository containing all project code, fulfilling the version control requirement. XAMPP provides a stable foundation for developing the complete inventory management system.</w:t>
-      </w:r>
-    </w:p>
-    <w:p/>
-    <w:p>
-      <w:pPr>
-        <w:pStyle w:val="Heading1"/>
-      </w:pPr>
-      <w:bookmarkStart w:id="9" w:name="_Toc232049304"/>
-      <w:r>
-        <w:t>WEEK 2</w:t>
+      <w:r>
+        <w:t xml:space="preserve"> </w:t>
+      </w:r>
+    </w:p>
+    <w:p>
+      <w:pPr>
+        <w:pStyle w:val="Heading2"/>
+      </w:pPr>
+      <w:bookmarkStart w:id="9" w:name="_Toc232049305"/>
+      <w:r>
+        <w:t>Fig 2.1</w:t>
       </w:r>
       <w:bookmarkEnd w:id="9"/>
-      <w:r>
-        <w:t xml:space="preserve"> </w:t>
-      </w:r>
-    </w:p>
-    <w:p>
-      <w:pPr>
-        <w:pStyle w:val="Heading2"/>
-      </w:pPr>
-      <w:bookmarkStart w:id="10" w:name="_Toc232049305"/>
-      <w:r>
-        <w:t>Fig 2.1</w:t>
-      </w:r>
-      <w:bookmarkEnd w:id="10"/>
     </w:p>
     <w:p>
       <w:r>
@@ -2351,11 +2351,11 @@
       <w:pPr>
         <w:pStyle w:val="Heading2"/>
       </w:pPr>
-      <w:bookmarkStart w:id="11" w:name="_Toc232049306"/>
+      <w:bookmarkStart w:id="10" w:name="_Toc232049306"/>
       <w:r>
         <w:t>Fig 2.2</w:t>
       </w:r>
-      <w:bookmarkEnd w:id="11"/>
+      <w:bookmarkEnd w:id="10"/>
     </w:p>
     <w:p>
       <w:r>
@@ -2454,11 +2454,11 @@
       <w:pPr>
         <w:pStyle w:val="Heading2"/>
       </w:pPr>
-      <w:bookmarkStart w:id="12" w:name="_Toc232049307"/>
+      <w:bookmarkStart w:id="11" w:name="_Toc232049307"/>
       <w:r>
         <w:t>Fig 2.3</w:t>
       </w:r>
-      <w:bookmarkEnd w:id="12"/>
+      <w:bookmarkEnd w:id="11"/>
     </w:p>
     <w:p>
       <w:r>
@@ -2553,11 +2553,11 @@
       <w:pPr>
         <w:pStyle w:val="Heading2"/>
       </w:pPr>
-      <w:bookmarkStart w:id="13" w:name="_Toc232049308"/>
+      <w:bookmarkStart w:id="12" w:name="_Toc232049308"/>
       <w:r>
         <w:t>FIG 2.4</w:t>
       </w:r>
-      <w:bookmarkEnd w:id="13"/>
+      <w:bookmarkEnd w:id="12"/>
     </w:p>
     <w:p>
       <w:pPr>
@@ -2869,44 +2869,44 @@
       <w:pPr>
         <w:pStyle w:val="Heading2"/>
       </w:pPr>
-      <w:bookmarkStart w:id="14" w:name="_Toc232049309"/>
+      <w:bookmarkStart w:id="13" w:name="_Toc232049309"/>
       <w:r>
         <w:t>WEEK 2 REFLECTION</w:t>
       </w:r>
+      <w:bookmarkEnd w:id="13"/>
+    </w:p>
+    <w:p>
+      <w:r>
+        <w:t>Week 2 focused on UI/UX planning and system design for Wan Shoes inventory system. I c</w:t>
+      </w:r>
+      <w:r>
+        <w:t>reated five digital wireframes</w:t>
+      </w:r>
+      <w:r>
+        <w:t xml:space="preserve"> covering login, admin dashboard, products page, sales recording, and sales reports. These wireframes establish the user flow for three roles: admin manages products and employees, clerks record sales, and stock</w:t>
+      </w:r>
+      <w:r>
+        <w:t xml:space="preserve"> managers add inventory. Fig 2.4</w:t>
+      </w:r>
+      <w:r>
+        <w:t xml:space="preserve"> documents the GUI color scheme using black, white, and gold for a professional premium aesthetic. The project proposal summary defines technical specifications including PHP/MySQL stack and five database tables</w:t>
+      </w:r>
+    </w:p>
+    <w:p>
+      <w:pPr>
+        <w:pStyle w:val="Heading2"/>
+        <w:rPr>
+          <w:lang w:val="en-GB"/>
+        </w:rPr>
+      </w:pPr>
+      <w:bookmarkStart w:id="14" w:name="_Toc232049310"/>
+      <w:r>
+        <w:rPr>
+          <w:lang w:val="en-GB"/>
+        </w:rPr>
+        <w:t>Project Proposal Summary</w:t>
+      </w:r>
       <w:bookmarkEnd w:id="14"/>
-    </w:p>
-    <w:p>
-      <w:r>
-        <w:t>Week 2 focused on UI/UX planning and system design for Wan Shoes inventory system. I c</w:t>
-      </w:r>
-      <w:r>
-        <w:t>reated five digital wireframes</w:t>
-      </w:r>
-      <w:r>
-        <w:t xml:space="preserve"> covering login, admin dashboard, products page, sales recording, and sales reports. These wireframes establish the user flow for three roles: admin manages products and employees, clerks record sales, and stock</w:t>
-      </w:r>
-      <w:r>
-        <w:t xml:space="preserve"> managers add inventory. Fig 2.4</w:t>
-      </w:r>
-      <w:r>
-        <w:t xml:space="preserve"> documents the GUI color scheme using black, white, and gold for a professional premium aesthetic. The project proposal summary defines technical specifications including PHP/MySQL stack and five database tables</w:t>
-      </w:r>
-    </w:p>
-    <w:p>
-      <w:pPr>
-        <w:pStyle w:val="Heading2"/>
-        <w:rPr>
-          <w:lang w:val="en-GB"/>
-        </w:rPr>
-      </w:pPr>
-      <w:bookmarkStart w:id="15" w:name="_Toc232049310"/>
-      <w:r>
-        <w:rPr>
-          <w:lang w:val="en-GB"/>
-        </w:rPr>
-        <w:t>Project Proposal Summary</w:t>
-      </w:r>
-      <w:bookmarkEnd w:id="15"/>
     </w:p>
     <w:p>
       <w:pPr>
@@ -3205,6 +3205,419 @@
       </w:r>
     </w:p>
     <w:p/>
+    <w:p>
+      <w:pPr>
+        <w:pStyle w:val="Heading1"/>
+      </w:pPr>
+      <w:r>
+        <w:lastRenderedPageBreak/>
+        <w:t>WEEK 3</w:t>
+      </w:r>
+    </w:p>
+    <w:p>
+      <w:pPr>
+        <w:pStyle w:val="Heading2"/>
+      </w:pPr>
+      <w:proofErr w:type="spellStart"/>
+      <w:r>
+        <w:t>Javascript</w:t>
+      </w:r>
+      <w:proofErr w:type="spellEnd"/>
+      <w:r>
+        <w:t xml:space="preserve"> and PHP Basics</w:t>
+      </w:r>
+    </w:p>
+    <w:p>
+      <w:pPr>
+        <w:rPr>
+          <w:u w:val="single"/>
+        </w:rPr>
+      </w:pPr>
+      <w:proofErr w:type="spellStart"/>
+      <w:r>
+        <w:rPr>
+          <w:u w:val="single"/>
+        </w:rPr>
+        <w:t>Javascript</w:t>
+      </w:r>
+      <w:proofErr w:type="spellEnd"/>
+      <w:r>
+        <w:rPr>
+          <w:u w:val="single"/>
+        </w:rPr>
+        <w:t xml:space="preserve"> form validation</w:t>
+      </w:r>
+    </w:p>
+    <w:p>
+      <w:r>
+        <w:t>Under the login page empty email or password is prevented</w:t>
+      </w:r>
+    </w:p>
+    <w:p>
+      <w:r>
+        <w:rPr>
+          <w:noProof/>
+          <w:lang w:val="en-GB" w:eastAsia="en-GB"/>
+          <w14:ligatures w14:val="none"/>
+        </w:rPr>
+        <w:drawing>
+          <wp:inline distT="0" distB="0" distL="0" distR="0">
+            <wp:extent cx="4709568" cy="5014395"/>
+            <wp:effectExtent l="0" t="0" r="0" b="0"/>
+            <wp:docPr id="1" name="Picture 1"/>
+            <wp:cNvGraphicFramePr>
+              <a:graphicFrameLocks xmlns:a="http://schemas.openxmlformats.org/drawingml/2006/main" noChangeAspect="1"/>
+            </wp:cNvGraphicFramePr>
+            <a:graphic xmlns:a="http://schemas.openxmlformats.org/drawingml/2006/main">
+              <a:graphicData uri="http://schemas.openxmlformats.org/drawingml/2006/picture">
+                <pic:pic xmlns:pic="http://schemas.openxmlformats.org/drawingml/2006/picture">
+                  <pic:nvPicPr>
+                    <pic:cNvPr id="1" name="Screenshot 2026-06-11 093826.png"/>
+                    <pic:cNvPicPr/>
+                  </pic:nvPicPr>
+                  <pic:blipFill>
+                    <a:blip r:embed="rId17">
+                      <a:extLst>
+                        <a:ext uri="{28A0092B-C50C-407E-A947-70E740481C1C}">
+                          <a14:useLocalDpi xmlns:a14="http://schemas.microsoft.com/office/drawing/2010/main" val="0"/>
+                        </a:ext>
+                      </a:extLst>
+                    </a:blip>
+                    <a:stretch>
+                      <a:fillRect/>
+                    </a:stretch>
+                  </pic:blipFill>
+                  <pic:spPr>
+                    <a:xfrm>
+                      <a:off x="0" y="0"/>
+                      <a:ext cx="4709568" cy="5014395"/>
+                    </a:xfrm>
+                    <a:prstGeom prst="rect">
+                      <a:avLst/>
+                    </a:prstGeom>
+                  </pic:spPr>
+                </pic:pic>
+              </a:graphicData>
+            </a:graphic>
+          </wp:inline>
+        </w:drawing>
+      </w:r>
+    </w:p>
+    <w:p>
+      <w:pPr>
+        <w:rPr>
+          <w:u w:val="single"/>
+        </w:rPr>
+      </w:pPr>
+      <w:r>
+        <w:rPr>
+          <w:u w:val="single"/>
+        </w:rPr>
+        <w:t>Password strength checker</w:t>
+      </w:r>
+    </w:p>
+    <w:p>
+      <w:r>
+        <w:t>While hiring new employees the employee creation form gives feedback in real time concerning password strength</w:t>
+      </w:r>
+    </w:p>
+    <w:p>
+      <w:r>
+        <w:rPr>
+          <w:noProof/>
+          <w:lang w:val="en-GB" w:eastAsia="en-GB"/>
+          <w14:ligatures w14:val="none"/>
+        </w:rPr>
+        <w:lastRenderedPageBreak/>
+        <w:drawing>
+          <wp:inline distT="0" distB="0" distL="0" distR="0">
+            <wp:extent cx="5731510" cy="2976245"/>
+            <wp:effectExtent l="0" t="0" r="2540" b="0"/>
+            <wp:docPr id="3" name="Picture 3"/>
+            <wp:cNvGraphicFramePr>
+              <a:graphicFrameLocks xmlns:a="http://schemas.openxmlformats.org/drawingml/2006/main" noChangeAspect="1"/>
+            </wp:cNvGraphicFramePr>
+            <a:graphic xmlns:a="http://schemas.openxmlformats.org/drawingml/2006/main">
+              <a:graphicData uri="http://schemas.openxmlformats.org/drawingml/2006/picture">
+                <pic:pic xmlns:pic="http://schemas.openxmlformats.org/drawingml/2006/picture">
+                  <pic:nvPicPr>
+                    <pic:cNvPr id="3" name="Screenshot 2026-06-11 094202.png"/>
+                    <pic:cNvPicPr/>
+                  </pic:nvPicPr>
+                  <pic:blipFill>
+                    <a:blip r:embed="rId18">
+                      <a:extLst>
+                        <a:ext uri="{28A0092B-C50C-407E-A947-70E740481C1C}">
+                          <a14:useLocalDpi xmlns:a14="http://schemas.microsoft.com/office/drawing/2010/main" val="0"/>
+                        </a:ext>
+                      </a:extLst>
+                    </a:blip>
+                    <a:stretch>
+                      <a:fillRect/>
+                    </a:stretch>
+                  </pic:blipFill>
+                  <pic:spPr>
+                    <a:xfrm>
+                      <a:off x="0" y="0"/>
+                      <a:ext cx="5731510" cy="2976245"/>
+                    </a:xfrm>
+                    <a:prstGeom prst="rect">
+                      <a:avLst/>
+                    </a:prstGeom>
+                  </pic:spPr>
+                </pic:pic>
+              </a:graphicData>
+            </a:graphic>
+          </wp:inline>
+        </w:drawing>
+      </w:r>
+    </w:p>
+    <w:p>
+      <w:r>
+        <w:rPr>
+          <w:noProof/>
+          <w:lang w:val="en-GB" w:eastAsia="en-GB"/>
+          <w14:ligatures w14:val="none"/>
+        </w:rPr>
+        <w:drawing>
+          <wp:inline distT="0" distB="0" distL="0" distR="0">
+            <wp:extent cx="5731510" cy="2997835"/>
+            <wp:effectExtent l="0" t="0" r="2540" b="0"/>
+            <wp:docPr id="4" name="Picture 4"/>
+            <wp:cNvGraphicFramePr>
+              <a:graphicFrameLocks xmlns:a="http://schemas.openxmlformats.org/drawingml/2006/main" noChangeAspect="1"/>
+            </wp:cNvGraphicFramePr>
+            <a:graphic xmlns:a="http://schemas.openxmlformats.org/drawingml/2006/main">
+              <a:graphicData uri="http://schemas.openxmlformats.org/drawingml/2006/picture">
+                <pic:pic xmlns:pic="http://schemas.openxmlformats.org/drawingml/2006/picture">
+                  <pic:nvPicPr>
+                    <pic:cNvPr id="4" name="Screenshot 2026-06-11 094141.png"/>
+                    <pic:cNvPicPr/>
+                  </pic:nvPicPr>
+                  <pic:blipFill>
+                    <a:blip r:embed="rId19">
+                      <a:extLst>
+                        <a:ext uri="{28A0092B-C50C-407E-A947-70E740481C1C}">
+                          <a14:useLocalDpi xmlns:a14="http://schemas.microsoft.com/office/drawing/2010/main" val="0"/>
+                        </a:ext>
+                      </a:extLst>
+                    </a:blip>
+                    <a:stretch>
+                      <a:fillRect/>
+                    </a:stretch>
+                  </pic:blipFill>
+                  <pic:spPr>
+                    <a:xfrm>
+                      <a:off x="0" y="0"/>
+                      <a:ext cx="5731510" cy="2997835"/>
+                    </a:xfrm>
+                    <a:prstGeom prst="rect">
+                      <a:avLst/>
+                    </a:prstGeom>
+                  </pic:spPr>
+                </pic:pic>
+              </a:graphicData>
+            </a:graphic>
+          </wp:inline>
+        </w:drawing>
+      </w:r>
+    </w:p>
+    <w:p>
+      <w:pPr>
+        <w:rPr>
+          <w:u w:val="single"/>
+        </w:rPr>
+      </w:pPr>
+      <w:r>
+        <w:rPr>
+          <w:u w:val="single"/>
+        </w:rPr>
+        <w:t>DOM Manipulation</w:t>
+      </w:r>
+    </w:p>
+    <w:p>
+      <w:r>
+        <w:t xml:space="preserve">While using </w:t>
+      </w:r>
+      <w:proofErr w:type="spellStart"/>
+      <w:r>
+        <w:t>javascript</w:t>
+      </w:r>
+      <w:proofErr w:type="spellEnd"/>
+      <w:r>
+        <w:t xml:space="preserve"> I enabled one to be able to see their password while logging in</w:t>
+      </w:r>
+    </w:p>
+    <w:p>
+      <w:r>
+        <w:rPr>
+          <w:noProof/>
+          <w:lang w:val="en-GB" w:eastAsia="en-GB"/>
+          <w14:ligatures w14:val="none"/>
+        </w:rPr>
+        <w:lastRenderedPageBreak/>
+        <w:drawing>
+          <wp:inline distT="0" distB="0" distL="0" distR="0">
+            <wp:extent cx="4922947" cy="5243014"/>
+            <wp:effectExtent l="0" t="0" r="0" b="0"/>
+            <wp:docPr id="6" name="Picture 6"/>
+            <wp:cNvGraphicFramePr>
+              <a:graphicFrameLocks xmlns:a="http://schemas.openxmlformats.org/drawingml/2006/main" noChangeAspect="1"/>
+            </wp:cNvGraphicFramePr>
+            <a:graphic xmlns:a="http://schemas.openxmlformats.org/drawingml/2006/main">
+              <a:graphicData uri="http://schemas.openxmlformats.org/drawingml/2006/picture">
+                <pic:pic xmlns:pic="http://schemas.openxmlformats.org/drawingml/2006/picture">
+                  <pic:nvPicPr>
+                    <pic:cNvPr id="6" name="Screenshot 2026-06-11 093739.png"/>
+                    <pic:cNvPicPr/>
+                  </pic:nvPicPr>
+                  <pic:blipFill>
+                    <a:blip r:embed="rId20">
+                      <a:extLst>
+                        <a:ext uri="{28A0092B-C50C-407E-A947-70E740481C1C}">
+                          <a14:useLocalDpi xmlns:a14="http://schemas.microsoft.com/office/drawing/2010/main" val="0"/>
+                        </a:ext>
+                      </a:extLst>
+                    </a:blip>
+                    <a:stretch>
+                      <a:fillRect/>
+                    </a:stretch>
+                  </pic:blipFill>
+                  <pic:spPr>
+                    <a:xfrm>
+                      <a:off x="0" y="0"/>
+                      <a:ext cx="4922947" cy="5243014"/>
+                    </a:xfrm>
+                    <a:prstGeom prst="rect">
+                      <a:avLst/>
+                    </a:prstGeom>
+                  </pic:spPr>
+                </pic:pic>
+              </a:graphicData>
+            </a:graphic>
+          </wp:inline>
+        </w:drawing>
+      </w:r>
+    </w:p>
+    <w:p>
+      <w:r>
+        <w:rPr>
+          <w:noProof/>
+          <w:lang w:val="en-GB" w:eastAsia="en-GB"/>
+          <w14:ligatures w14:val="none"/>
+        </w:rPr>
+        <w:lastRenderedPageBreak/>
+        <w:drawing>
+          <wp:inline distT="0" distB="0" distL="0" distR="0">
+            <wp:extent cx="5646909" cy="5997460"/>
+            <wp:effectExtent l="0" t="0" r="0" b="3810"/>
+            <wp:docPr id="15" name="Picture 15"/>
+            <wp:cNvGraphicFramePr>
+              <a:graphicFrameLocks xmlns:a="http://schemas.openxmlformats.org/drawingml/2006/main" noChangeAspect="1"/>
+            </wp:cNvGraphicFramePr>
+            <a:graphic xmlns:a="http://schemas.openxmlformats.org/drawingml/2006/main">
+              <a:graphicData uri="http://schemas.openxmlformats.org/drawingml/2006/picture">
+                <pic:pic xmlns:pic="http://schemas.openxmlformats.org/drawingml/2006/picture">
+                  <pic:nvPicPr>
+                    <pic:cNvPr id="15" name="Screenshot 2026-06-11 093708.png"/>
+                    <pic:cNvPicPr/>
+                  </pic:nvPicPr>
+                  <pic:blipFill>
+                    <a:blip r:embed="rId21">
+                      <a:extLst>
+                        <a:ext uri="{28A0092B-C50C-407E-A947-70E740481C1C}">
+                          <a14:useLocalDpi xmlns:a14="http://schemas.microsoft.com/office/drawing/2010/main" val="0"/>
+                        </a:ext>
+                      </a:extLst>
+                    </a:blip>
+                    <a:stretch>
+                      <a:fillRect/>
+                    </a:stretch>
+                  </pic:blipFill>
+                  <pic:spPr>
+                    <a:xfrm>
+                      <a:off x="0" y="0"/>
+                      <a:ext cx="5646909" cy="5997460"/>
+                    </a:xfrm>
+                    <a:prstGeom prst="rect">
+                      <a:avLst/>
+                    </a:prstGeom>
+                  </pic:spPr>
+                </pic:pic>
+              </a:graphicData>
+            </a:graphic>
+          </wp:inline>
+        </w:drawing>
+      </w:r>
+    </w:p>
+    <w:p/>
+    <w:p>
+      <w:pPr>
+        <w:rPr>
+          <w:u w:val="single"/>
+        </w:rPr>
+      </w:pPr>
+      <w:r>
+        <w:rPr>
+          <w:u w:val="single"/>
+        </w:rPr>
+        <w:t>Student Reflection</w:t>
+      </w:r>
+    </w:p>
+    <w:p>
+      <w:r>
+        <w:t>Week 3 introduced frontend validation using JavaScript and backend foundations with PHP for the Wan Shoes inventory system. I implemented client-side form validation on the login page using </w:t>
+      </w:r>
+      <w:proofErr w:type="spellStart"/>
+      <w:proofErr w:type="gramStart"/>
+      <w:r>
+        <w:t>validateLogin</w:t>
+      </w:r>
+      <w:proofErr w:type="spellEnd"/>
+      <w:r>
+        <w:t>(</w:t>
+      </w:r>
+      <w:proofErr w:type="gramEnd"/>
+      <w:r>
+        <w:t>) function, preventing empty email or password submissions before data reaches the server — improving user experience and reducing invalid requests. A real-time password strength checker was added to the employee creation form, evaluating passwords based on character length (4-7 chars = Medium, 8+ = Strong) and displaying color-coded feedback (red, orange, green). PHP syntax was verified using echo statements and variable manipulation in test files. Database connectivity was confirmed using </w:t>
+      </w:r>
+      <w:proofErr w:type="spellStart"/>
+      <w:r>
+        <w:t>mysqli_</w:t>
+      </w:r>
+      <w:proofErr w:type="gramStart"/>
+      <w:r>
+        <w:t>connect</w:t>
+      </w:r>
+      <w:proofErr w:type="spellEnd"/>
+      <w:r>
+        <w:t>(</w:t>
+      </w:r>
+      <w:proofErr w:type="gramEnd"/>
+      <w:r>
+        <w:t>"localhost", "root", "", "</w:t>
+      </w:r>
+      <w:proofErr w:type="spellStart"/>
+      <w:r>
+        <w:t>wan_shoes_db</w:t>
+      </w:r>
+      <w:proofErr w:type="spellEnd"/>
+      <w:r>
+        <w:t xml:space="preserve">"), successfully connecting to </w:t>
+      </w:r>
+      <w:r>
+        <w:lastRenderedPageBreak/>
+        <w:t>the MySQL database. A password visibility toggle using DOM manipulation was also implemented, allowing users to show/hide passwor</w:t>
+      </w:r>
+      <w:r>
+        <w:t>d text by clicking an eye icon.</w:t>
+      </w:r>
+      <w:bookmarkStart w:id="15" w:name="_GoBack"/>
+      <w:bookmarkEnd w:id="15"/>
+      <w:r>
+        <w:t xml:space="preserve"> These foundational skills enable form processing, user authentication, and database integration for Weeks 4-5.</w:t>
+      </w:r>
+    </w:p>
     <w:p/>
     <w:sectPr>
       <w:pgSz w:w="11906" w:h="16838"/>
@@ -3823,7 +4236,6 @@
   <w:style w:type="character" w:default="1" w:styleId="DefaultParagraphFont">
     <w:name w:val="Default Paragraph Font"/>
     <w:uiPriority w:val="1"/>
-    <w:semiHidden/>
     <w:unhideWhenUsed/>
   </w:style>
   <w:style w:type="table" w:default="1" w:styleId="TableNormal">
@@ -4241,7 +4653,7 @@
 </file>
 
 <file path=customXml/itemProps1.xml><?xml version="1.0" encoding="utf-8"?>
-<ds:datastoreItem xmlns:ds="http://schemas.openxmlformats.org/officeDocument/2006/customXml" ds:itemID="{95E9EE91-02C9-4400-8D5E-38F0DB1D8644}">
+<ds:datastoreItem xmlns:ds="http://schemas.openxmlformats.org/officeDocument/2006/customXml" ds:itemID="{FE6C559B-F2E5-49FE-8C9D-EE7BB9130C31}">
   <ds:schemaRefs>
     <ds:schemaRef ds:uri="http://schemas.openxmlformats.org/officeDocument/2006/bibliography"/>
   </ds:schemaRefs>

</xml_diff>

<commit_message>
Week 4 addition of work on the logbook
</commit_message>
<xml_diff>
--- a/LOGBOOK.docx
+++ b/LOGBOOK.docx
@@ -1625,15 +1625,7 @@
         <w:spacing w:afterLines="160" w:after="384"/>
       </w:pPr>
       <w:r>
-        <w:t xml:space="preserve">Browser accessing http://localhost/phpmyadmin displaying </w:t>
-      </w:r>
-      <w:proofErr w:type="spellStart"/>
-      <w:r>
-        <w:t>phpMyAdmin</w:t>
-      </w:r>
-      <w:proofErr w:type="spellEnd"/>
-      <w:r>
-        <w:t xml:space="preserve"> dashboard. This confirms MySQL server is running and accessible via web interface.</w:t>
+        <w:t>Browser accessing http://localhost/phpmyadmin displaying phpMyAdmin dashboard. This confirms MySQL server is running and accessible via web interface.</w:t>
       </w:r>
     </w:p>
     <w:p>
@@ -1743,13 +1735,8 @@
       </w:r>
       <w:proofErr w:type="gramStart"/>
       <w:r>
-        <w:t>&lt;?</w:t>
-      </w:r>
-      <w:proofErr w:type="spellStart"/>
-      <w:r>
-        <w:t>php</w:t>
-      </w:r>
-      <w:proofErr w:type="spellEnd"/>
+        <w:t>&lt;?php</w:t>
+      </w:r>
       <w:proofErr w:type="gramEnd"/>
       <w:r>
         <w:t xml:space="preserve"> echo "Hello World</w:t>
@@ -1863,30 +1850,12 @@
       <w:bookmarkEnd w:id="4"/>
     </w:p>
     <w:p>
-      <w:proofErr w:type="spellStart"/>
       <w:r>
         <w:t>P</w:t>
       </w:r>
       <w:r>
-        <w:t>hpMyAdmin</w:t>
-      </w:r>
-      <w:proofErr w:type="spellEnd"/>
-      <w:r>
-        <w:t xml:space="preserve"> interface showing </w:t>
-      </w:r>
-      <w:proofErr w:type="spellStart"/>
-      <w:r>
-        <w:t>wan_shoes_db</w:t>
-      </w:r>
-      <w:proofErr w:type="spellEnd"/>
-      <w:r>
-        <w:t xml:space="preserve"> database created with utf8_general_ci collation. The database contains five tables: admins, employees, products, sales, and </w:t>
-      </w:r>
-      <w:proofErr w:type="spellStart"/>
-      <w:r>
-        <w:t>stock_records</w:t>
-      </w:r>
-      <w:proofErr w:type="spellEnd"/>
+        <w:t>hpMyAdmin interface showing wan_shoes_db database created with utf8_general_ci collation. The database contains five tables: admins, employees, products, sales, and stock_records</w:t>
+      </w:r>
     </w:p>
     <w:p>
       <w:pPr>
@@ -1967,13 +1936,8 @@
         <w:fldChar w:fldCharType="end"/>
       </w:r>
       <w:r>
-        <w:t xml:space="preserve"> </w:t>
-      </w:r>
-      <w:proofErr w:type="spellStart"/>
-      <w:r>
-        <w:t>wan_shoes_d</w:t>
-      </w:r>
-      <w:proofErr w:type="spellEnd"/>
+        <w:t xml:space="preserve"> wan_shoes_d</w:t>
+      </w:r>
     </w:p>
     <w:p>
       <w:pPr>
@@ -1987,31 +1951,7 @@
     </w:p>
     <w:p>
       <w:r>
-        <w:t>S Code folder structure showing </w:t>
-      </w:r>
-      <w:proofErr w:type="spellStart"/>
-      <w:r>
-        <w:t>wan_shoes</w:t>
-      </w:r>
-      <w:proofErr w:type="spellEnd"/>
-      <w:r>
-        <w:t xml:space="preserve"> project root with subdirectories: admin/, </w:t>
-      </w:r>
-      <w:proofErr w:type="spellStart"/>
-      <w:r>
-        <w:t>css</w:t>
-      </w:r>
-      <w:proofErr w:type="spellEnd"/>
-      <w:r>
-        <w:t xml:space="preserve">/, images/, </w:t>
-      </w:r>
-      <w:proofErr w:type="spellStart"/>
-      <w:r>
-        <w:t>js</w:t>
-      </w:r>
-      <w:proofErr w:type="spellEnd"/>
-      <w:r>
-        <w:t>/, products/, sales/, stock/, and includes/. This follows professional web development organization standards.</w:t>
+        <w:t>S Code folder structure showing wan_shoes project root with subdirectories: admin/, css/, images/, js/, products/, sales/, stock/, and includes/. This follows professional web development organization standards.</w:t>
       </w:r>
     </w:p>
     <w:p>
@@ -2203,31 +2143,7 @@
         <w:t xml:space="preserve">I installed XAMPP </w:t>
       </w:r>
       <w:r>
-        <w:t>on Windows 11 to create a local web development environment for the Wan Shoes inventory system. Fig 1.1 shows Apache and MySQL services running without port conflicts, which is essential for PHP processing and database connectivity. Fig 1.3 demonstrates successful PHP execution where a simple echo statement rendered "Hello World" in the browser, confirming the server properly parses PHP code. Fig 1.4 displays </w:t>
-      </w:r>
-      <w:proofErr w:type="spellStart"/>
-      <w:r>
-        <w:t>wan_shoes_db</w:t>
-      </w:r>
-      <w:proofErr w:type="spellEnd"/>
-      <w:r>
-        <w:t xml:space="preserve"> created in </w:t>
-      </w:r>
-      <w:proofErr w:type="spellStart"/>
-      <w:r>
-        <w:t>phpMyAdmin</w:t>
-      </w:r>
-      <w:proofErr w:type="spellEnd"/>
-      <w:r>
-        <w:t xml:space="preserve"> with five relational tables: admins, employees, products, sales, and </w:t>
-      </w:r>
-      <w:proofErr w:type="spellStart"/>
-      <w:r>
-        <w:t>stock_records</w:t>
-      </w:r>
-      <w:proofErr w:type="spellEnd"/>
-      <w:r>
-        <w:t>. The folder structure in Fig 1.5 follows MVC-inspired organization with separate directories for CSS, JavaScript, and feature modules. Finally, Fig 1.6 shows the GitHub repository containing all project code, fulfilling the version control requirement. XAMPP provides a stable foundation for developing the complete inventory management system.</w:t>
+        <w:t>on Windows 11 to create a local web development environment for the Wan Shoes inventory system. Fig 1.1 shows Apache and MySQL services running without port conflicts, which is essential for PHP processing and database connectivity. Fig 1.3 demonstrates successful PHP execution where a simple echo statement rendered "Hello World" in the browser, confirming the server properly parses PHP code. Fig 1.4 displays wan_shoes_db created in phpMyAdmin with five relational tables: admins, employees, products, sales, and stock_records. The folder structure in Fig 1.5 follows MVC-inspired organization with separate directories for CSS, JavaScript, and feature modules. Finally, Fig 1.6 shows the GitHub repository containing all project code, fulfilling the version control requirement. XAMPP provides a stable foundation for developing the complete inventory management system.</w:t>
       </w:r>
     </w:p>
     <w:p/>
@@ -2339,13 +2255,8 @@
         <w:fldChar w:fldCharType="end"/>
       </w:r>
       <w:r>
-        <w:t xml:space="preserve">Login </w:t>
-      </w:r>
-      <w:proofErr w:type="spellStart"/>
-      <w:r>
-        <w:t>wirefreame</w:t>
-      </w:r>
-      <w:proofErr w:type="spellEnd"/>
+        <w:t>Login wirefreame</w:t>
+      </w:r>
     </w:p>
     <w:p>
       <w:pPr>
@@ -2442,13 +2353,8 @@
         <w:fldChar w:fldCharType="end"/>
       </w:r>
       <w:r>
-        <w:t xml:space="preserve"> </w:t>
-      </w:r>
-      <w:proofErr w:type="spellStart"/>
-      <w:r>
-        <w:t>Dashboaard</w:t>
-      </w:r>
-      <w:proofErr w:type="spellEnd"/>
+        <w:t xml:space="preserve"> Dashboaard</w:t>
+      </w:r>
     </w:p>
     <w:p>
       <w:pPr>
@@ -3173,16 +3079,8 @@
         <w:rPr>
           <w:lang w:val="en-GB"/>
         </w:rPr>
-        <w:t xml:space="preserve"> admins, employees, products, sales, </w:t>
-      </w:r>
-      <w:proofErr w:type="spellStart"/>
-      <w:r>
-        <w:rPr>
-          <w:lang w:val="en-GB"/>
-        </w:rPr>
-        <w:t>stock_records</w:t>
-      </w:r>
-      <w:proofErr w:type="spellEnd"/>
+        <w:t> admins, employees, products, sales, stock_records</w:t>
+      </w:r>
     </w:p>
     <w:p>
       <w:pPr>
@@ -3218,13 +3116,8 @@
       <w:pPr>
         <w:pStyle w:val="Heading2"/>
       </w:pPr>
-      <w:proofErr w:type="spellStart"/>
-      <w:r>
-        <w:t>Javascript</w:t>
-      </w:r>
-      <w:proofErr w:type="spellEnd"/>
-      <w:r>
-        <w:t xml:space="preserve"> and PHP Basics</w:t>
+      <w:r>
+        <w:t>Javascript and PHP Basics</w:t>
       </w:r>
     </w:p>
     <w:p>
@@ -3233,19 +3126,11 @@
           <w:u w:val="single"/>
         </w:rPr>
       </w:pPr>
-      <w:proofErr w:type="spellStart"/>
       <w:r>
         <w:rPr>
           <w:u w:val="single"/>
         </w:rPr>
-        <w:t>Javascript</w:t>
-      </w:r>
-      <w:proofErr w:type="spellEnd"/>
-      <w:r>
-        <w:rPr>
-          <w:u w:val="single"/>
-        </w:rPr>
-        <w:t xml:space="preserve"> form validation</w:t>
+        <w:t>Javascript form validation</w:t>
       </w:r>
     </w:p>
     <w:p>
@@ -3254,6 +3139,9 @@
       </w:r>
     </w:p>
     <w:p>
+      <w:pPr>
+        <w:keepNext/>
+      </w:pPr>
       <w:r>
         <w:rPr>
           <w:noProof/>
@@ -3261,7 +3149,7 @@
           <w14:ligatures w14:val="none"/>
         </w:rPr>
         <w:drawing>
-          <wp:inline distT="0" distB="0" distL="0" distR="0">
+          <wp:inline distT="0" distB="0" distL="0" distR="0" wp14:anchorId="73C66E77" wp14:editId="1E88C511">
             <wp:extent cx="4709568" cy="5014395"/>
             <wp:effectExtent l="0" t="0" r="0" b="0"/>
             <wp:docPr id="1" name="Picture 1"/>
@@ -3305,6 +3193,35 @@
     </w:p>
     <w:p>
       <w:pPr>
+        <w:pStyle w:val="Caption"/>
+      </w:pPr>
+      <w:r>
+        <w:t xml:space="preserve">Figure </w:t>
+      </w:r>
+      <w:r>
+        <w:fldChar w:fldCharType="begin"/>
+      </w:r>
+      <w:r>
+        <w:instrText xml:space="preserve"> SEQ Figure \* ARABIC </w:instrText>
+      </w:r>
+      <w:r>
+        <w:fldChar w:fldCharType="separate"/>
+      </w:r>
+      <w:r>
+        <w:rPr>
+          <w:noProof/>
+        </w:rPr>
+        <w:t>9</w:t>
+      </w:r>
+      <w:r>
+        <w:fldChar w:fldCharType="end"/>
+      </w:r>
+      <w:r>
+        <w:t xml:space="preserve"> Form validation</w:t>
+      </w:r>
+    </w:p>
+    <w:p>
+      <w:pPr>
         <w:rPr>
           <w:u w:val="single"/>
         </w:rPr>
@@ -3322,6 +3239,9 @@
       </w:r>
     </w:p>
     <w:p>
+      <w:pPr>
+        <w:keepNext/>
+      </w:pPr>
       <w:r>
         <w:rPr>
           <w:noProof/>
@@ -3330,7 +3250,7 @@
         </w:rPr>
         <w:lastRenderedPageBreak/>
         <w:drawing>
-          <wp:inline distT="0" distB="0" distL="0" distR="0">
+          <wp:inline distT="0" distB="0" distL="0" distR="0" wp14:anchorId="1F905F9F" wp14:editId="00B11375">
             <wp:extent cx="5731510" cy="2976245"/>
             <wp:effectExtent l="0" t="0" r="2540" b="0"/>
             <wp:docPr id="3" name="Picture 3"/>
@@ -3373,6 +3293,38 @@
       </w:r>
     </w:p>
     <w:p>
+      <w:pPr>
+        <w:pStyle w:val="Caption"/>
+      </w:pPr>
+      <w:r>
+        <w:t xml:space="preserve">Figure </w:t>
+      </w:r>
+      <w:r>
+        <w:fldChar w:fldCharType="begin"/>
+      </w:r>
+      <w:r>
+        <w:instrText xml:space="preserve"> SEQ Figure \* ARABIC </w:instrText>
+      </w:r>
+      <w:r>
+        <w:fldChar w:fldCharType="separate"/>
+      </w:r>
+      <w:r>
+        <w:rPr>
+          <w:noProof/>
+        </w:rPr>
+        <w:t>10</w:t>
+      </w:r>
+      <w:r>
+        <w:fldChar w:fldCharType="end"/>
+      </w:r>
+      <w:r>
+        <w:t xml:space="preserve"> Strong password</w:t>
+      </w:r>
+    </w:p>
+    <w:p>
+      <w:pPr>
+        <w:keepNext/>
+      </w:pPr>
       <w:r>
         <w:rPr>
           <w:noProof/>
@@ -3380,7 +3332,7 @@
           <w14:ligatures w14:val="none"/>
         </w:rPr>
         <w:drawing>
-          <wp:inline distT="0" distB="0" distL="0" distR="0">
+          <wp:inline distT="0" distB="0" distL="0" distR="0" wp14:anchorId="384A779F" wp14:editId="1BDBEE73">
             <wp:extent cx="5731510" cy="2997835"/>
             <wp:effectExtent l="0" t="0" r="2540" b="0"/>
             <wp:docPr id="4" name="Picture 4"/>
@@ -3424,6 +3376,35 @@
     </w:p>
     <w:p>
       <w:pPr>
+        <w:pStyle w:val="Caption"/>
+      </w:pPr>
+      <w:r>
+        <w:t xml:space="preserve">Figure </w:t>
+      </w:r>
+      <w:r>
+        <w:fldChar w:fldCharType="begin"/>
+      </w:r>
+      <w:r>
+        <w:instrText xml:space="preserve"> SEQ Figure \* ARABIC </w:instrText>
+      </w:r>
+      <w:r>
+        <w:fldChar w:fldCharType="separate"/>
+      </w:r>
+      <w:r>
+        <w:rPr>
+          <w:noProof/>
+        </w:rPr>
+        <w:t>11</w:t>
+      </w:r>
+      <w:r>
+        <w:fldChar w:fldCharType="end"/>
+      </w:r>
+      <w:r>
+        <w:t xml:space="preserve"> Weak Password</w:t>
+      </w:r>
+    </w:p>
+    <w:p>
+      <w:pPr>
         <w:rPr>
           <w:u w:val="single"/>
         </w:rPr>
@@ -3437,18 +3418,13 @@
     </w:p>
     <w:p>
       <w:r>
-        <w:t xml:space="preserve">While using </w:t>
-      </w:r>
-      <w:proofErr w:type="spellStart"/>
-      <w:r>
-        <w:t>javascript</w:t>
-      </w:r>
-      <w:proofErr w:type="spellEnd"/>
-      <w:r>
-        <w:t xml:space="preserve"> I enabled one to be able to see their password while logging in</w:t>
-      </w:r>
-    </w:p>
-    <w:p>
+        <w:t>While using javascript I enabled one to be able to see their password while logging in</w:t>
+      </w:r>
+    </w:p>
+    <w:p>
+      <w:pPr>
+        <w:keepNext/>
+      </w:pPr>
       <w:r>
         <w:rPr>
           <w:noProof/>
@@ -3457,7 +3433,7 @@
         </w:rPr>
         <w:lastRenderedPageBreak/>
         <w:drawing>
-          <wp:inline distT="0" distB="0" distL="0" distR="0">
+          <wp:inline distT="0" distB="0" distL="0" distR="0" wp14:anchorId="7C93865A" wp14:editId="42962A73">
             <wp:extent cx="4922947" cy="5243014"/>
             <wp:effectExtent l="0" t="0" r="0" b="0"/>
             <wp:docPr id="6" name="Picture 6"/>
@@ -3500,6 +3476,38 @@
       </w:r>
     </w:p>
     <w:p>
+      <w:pPr>
+        <w:pStyle w:val="Caption"/>
+      </w:pPr>
+      <w:r>
+        <w:t xml:space="preserve">Figure </w:t>
+      </w:r>
+      <w:r>
+        <w:fldChar w:fldCharType="begin"/>
+      </w:r>
+      <w:r>
+        <w:instrText xml:space="preserve"> SEQ Figure \* ARABIC </w:instrText>
+      </w:r>
+      <w:r>
+        <w:fldChar w:fldCharType="separate"/>
+      </w:r>
+      <w:r>
+        <w:rPr>
+          <w:noProof/>
+        </w:rPr>
+        <w:t>12</w:t>
+      </w:r>
+      <w:r>
+        <w:fldChar w:fldCharType="end"/>
+      </w:r>
+      <w:r>
+        <w:t xml:space="preserve"> Password visible</w:t>
+      </w:r>
+    </w:p>
+    <w:p>
+      <w:pPr>
+        <w:keepNext/>
+      </w:pPr>
       <w:r>
         <w:rPr>
           <w:noProof/>
@@ -3508,7 +3516,7 @@
         </w:rPr>
         <w:lastRenderedPageBreak/>
         <w:drawing>
-          <wp:inline distT="0" distB="0" distL="0" distR="0">
+          <wp:inline distT="0" distB="0" distL="0" distR="0" wp14:anchorId="49C72A01" wp14:editId="78A3462C">
             <wp:extent cx="5646909" cy="5997460"/>
             <wp:effectExtent l="0" t="0" r="0" b="3810"/>
             <wp:docPr id="15" name="Picture 15"/>
@@ -3550,6 +3558,35 @@
         </w:drawing>
       </w:r>
     </w:p>
+    <w:p>
+      <w:pPr>
+        <w:pStyle w:val="Caption"/>
+      </w:pPr>
+      <w:r>
+        <w:t xml:space="preserve">Figure </w:t>
+      </w:r>
+      <w:r>
+        <w:fldChar w:fldCharType="begin"/>
+      </w:r>
+      <w:r>
+        <w:instrText xml:space="preserve"> SEQ Figure \* ARABIC </w:instrText>
+      </w:r>
+      <w:r>
+        <w:fldChar w:fldCharType="separate"/>
+      </w:r>
+      <w:r>
+        <w:rPr>
+          <w:noProof/>
+        </w:rPr>
+        <w:t>13</w:t>
+      </w:r>
+      <w:r>
+        <w:fldChar w:fldCharType="end"/>
+      </w:r>
+      <w:r>
+        <w:t>Password hidden</w:t>
+      </w:r>
+    </w:p>
     <w:p/>
     <w:p>
       <w:pPr>
@@ -3568,55 +3605,494 @@
       <w:r>
         <w:t>Week 3 introduced frontend validation using JavaScript and backend foundations with PHP for the Wan Shoes inventory system. I implemented client-side form validation on the login page using </w:t>
       </w:r>
-      <w:proofErr w:type="spellStart"/>
       <w:proofErr w:type="gramStart"/>
       <w:r>
-        <w:t>validateLogin</w:t>
-      </w:r>
-      <w:proofErr w:type="spellEnd"/>
-      <w:r>
-        <w:t>(</w:t>
+        <w:t>validateLogin(</w:t>
       </w:r>
       <w:proofErr w:type="gramEnd"/>
       <w:r>
-        <w:t>) function, preventing empty email or password submissions before data reaches the server — improving user experience and reducing invalid requests. A real-time password strength checker was added to the employee creation form, evaluating passwords based on character length (4-7 chars = Medium, 8+ = Strong) and displaying color-coded feedback (red, orange, green). PHP syntax was verified using echo statements and variable manipulation in test files. Database connectivity was confirmed using </w:t>
-      </w:r>
-      <w:proofErr w:type="spellStart"/>
-      <w:r>
-        <w:t>mysqli_</w:t>
+        <w:t xml:space="preserve">) function, preventing empty email or password submissions before data reaches the server — improving user experience and reducing invalid requests. A real-time password strength checker was added to the employee creation form, evaluating passwords based on character length (4-7 chars = Medium, 8+ = Strong) and displaying color-coded feedback (red, orange, green). PHP syntax was verified using echo statements and variable manipulation in test files. Database connectivity was confirmed </w:t>
+      </w:r>
+      <w:r>
+        <w:lastRenderedPageBreak/>
+        <w:t>using mysqli_</w:t>
       </w:r>
       <w:proofErr w:type="gramStart"/>
       <w:r>
-        <w:t>connect</w:t>
-      </w:r>
-      <w:proofErr w:type="spellEnd"/>
-      <w:r>
-        <w:t>(</w:t>
+        <w:t>connect(</w:t>
       </w:r>
       <w:proofErr w:type="gramEnd"/>
       <w:r>
-        <w:t>"localhost", "root", "", "</w:t>
-      </w:r>
-      <w:proofErr w:type="spellStart"/>
-      <w:r>
-        <w:t>wan_shoes_db</w:t>
-      </w:r>
-      <w:proofErr w:type="spellEnd"/>
-      <w:r>
-        <w:t xml:space="preserve">"), successfully connecting to </w:t>
-      </w:r>
-      <w:r>
+        <w:t>"localhost", "root", "", "wan_shoes_db"), successfully connecting to the MySQL database. A password visibility toggle using DOM manipulation was also implemented, allowing users to show/hide passwor</w:t>
+      </w:r>
+      <w:r>
+        <w:t>d text by clicking an eye icon.</w:t>
+      </w:r>
+      <w:r>
+        <w:t xml:space="preserve"> These foundational skills enable form processing, user authentication, and database integration for Weeks 4-5.</w:t>
+      </w:r>
+    </w:p>
+    <w:p/>
+    <w:p>
+      <w:pPr>
+        <w:pStyle w:val="Heading1"/>
+      </w:pPr>
+      <w:r>
+        <w:t xml:space="preserve">WEEK 4 </w:t>
+      </w:r>
+      <w:r>
+        <w:t>Server Side Components and Backend Development</w:t>
+      </w:r>
+    </w:p>
+    <w:p>
+      <w:r>
+        <w:t>Role Based Login system</w:t>
+      </w:r>
+    </w:p>
+    <w:p>
+      <w:r>
+        <w:t xml:space="preserve">The system serves three roles of users under </w:t>
+      </w:r>
+      <w:proofErr w:type="gramStart"/>
+      <w:r>
+        <w:t>it ;</w:t>
+      </w:r>
+      <w:proofErr w:type="gramEnd"/>
+      <w:r>
+        <w:t xml:space="preserve"> admins, clerks and stock managers and their respective area of work is distinguished based on their login info</w:t>
+      </w:r>
+    </w:p>
+    <w:p>
+      <w:pPr>
+        <w:rPr>
+          <w:u w:val="single"/>
+        </w:rPr>
+      </w:pPr>
+      <w:r>
+        <w:rPr>
+          <w:u w:val="single"/>
+        </w:rPr>
+        <w:t>Admin</w:t>
+      </w:r>
+      <w:r>
+        <w:rPr>
+          <w:u w:val="single"/>
+        </w:rPr>
+        <w:t xml:space="preserve"> login</w:t>
+      </w:r>
+    </w:p>
+    <w:p>
+      <w:pPr>
+        <w:rPr>
+          <w:u w:val="single"/>
+        </w:rPr>
+      </w:pPr>
+      <w:r>
+        <w:rPr>
+          <w:noProof/>
+          <w:u w:val="single"/>
+          <w:lang w:val="en-GB" w:eastAsia="en-GB"/>
+          <w14:ligatures w14:val="none"/>
+        </w:rPr>
+        <w:drawing>
+          <wp:inline distT="0" distB="0" distL="0" distR="0">
+            <wp:extent cx="4610500" cy="5090601"/>
+            <wp:effectExtent l="0" t="0" r="0" b="0"/>
+            <wp:docPr id="16" name="Picture 16"/>
+            <wp:cNvGraphicFramePr>
+              <a:graphicFrameLocks xmlns:a="http://schemas.openxmlformats.org/drawingml/2006/main" noChangeAspect="1"/>
+            </wp:cNvGraphicFramePr>
+            <a:graphic xmlns:a="http://schemas.openxmlformats.org/drawingml/2006/main">
+              <a:graphicData uri="http://schemas.openxmlformats.org/drawingml/2006/picture">
+                <pic:pic xmlns:pic="http://schemas.openxmlformats.org/drawingml/2006/picture">
+                  <pic:nvPicPr>
+                    <pic:cNvPr id="16" name="Screenshot 2026-06-11 095235.png"/>
+                    <pic:cNvPicPr/>
+                  </pic:nvPicPr>
+                  <pic:blipFill>
+                    <a:blip r:embed="rId22">
+                      <a:extLst>
+                        <a:ext uri="{28A0092B-C50C-407E-A947-70E740481C1C}">
+                          <a14:useLocalDpi xmlns:a14="http://schemas.microsoft.com/office/drawing/2010/main" val="0"/>
+                        </a:ext>
+                      </a:extLst>
+                    </a:blip>
+                    <a:stretch>
+                      <a:fillRect/>
+                    </a:stretch>
+                  </pic:blipFill>
+                  <pic:spPr>
+                    <a:xfrm>
+                      <a:off x="0" y="0"/>
+                      <a:ext cx="4610500" cy="5090601"/>
+                    </a:xfrm>
+                    <a:prstGeom prst="rect">
+                      <a:avLst/>
+                    </a:prstGeom>
+                  </pic:spPr>
+                </pic:pic>
+              </a:graphicData>
+            </a:graphic>
+          </wp:inline>
+        </w:drawing>
+      </w:r>
+    </w:p>
+    <w:p>
+      <w:pPr>
+        <w:rPr>
+          <w:u w:val="single"/>
+        </w:rPr>
+      </w:pPr>
+      <w:r>
+        <w:rPr>
+          <w:noProof/>
+          <w:u w:val="single"/>
+          <w:lang w:val="en-GB" w:eastAsia="en-GB"/>
+          <w14:ligatures w14:val="none"/>
+        </w:rPr>
         <w:lastRenderedPageBreak/>
-        <w:t>the MySQL database. A password visibility toggle using DOM manipulation was also implemented, allowing users to show/hide passwor</w:t>
-      </w:r>
-      <w:r>
-        <w:t>d text by clicking an eye icon.</w:t>
+        <w:drawing>
+          <wp:inline distT="0" distB="0" distL="0" distR="0">
+            <wp:extent cx="5731510" cy="4825365"/>
+            <wp:effectExtent l="0" t="0" r="2540" b="0"/>
+            <wp:docPr id="17" name="Picture 17"/>
+            <wp:cNvGraphicFramePr>
+              <a:graphicFrameLocks xmlns:a="http://schemas.openxmlformats.org/drawingml/2006/main" noChangeAspect="1"/>
+            </wp:cNvGraphicFramePr>
+            <a:graphic xmlns:a="http://schemas.openxmlformats.org/drawingml/2006/main">
+              <a:graphicData uri="http://schemas.openxmlformats.org/drawingml/2006/picture">
+                <pic:pic xmlns:pic="http://schemas.openxmlformats.org/drawingml/2006/picture">
+                  <pic:nvPicPr>
+                    <pic:cNvPr id="17" name="Screenshot 2026-06-11 095311.png"/>
+                    <pic:cNvPicPr/>
+                  </pic:nvPicPr>
+                  <pic:blipFill>
+                    <a:blip r:embed="rId23">
+                      <a:extLst>
+                        <a:ext uri="{28A0092B-C50C-407E-A947-70E740481C1C}">
+                          <a14:useLocalDpi xmlns:a14="http://schemas.microsoft.com/office/drawing/2010/main" val="0"/>
+                        </a:ext>
+                      </a:extLst>
+                    </a:blip>
+                    <a:stretch>
+                      <a:fillRect/>
+                    </a:stretch>
+                  </pic:blipFill>
+                  <pic:spPr>
+                    <a:xfrm>
+                      <a:off x="0" y="0"/>
+                      <a:ext cx="5731510" cy="4825365"/>
+                    </a:xfrm>
+                    <a:prstGeom prst="rect">
+                      <a:avLst/>
+                    </a:prstGeom>
+                  </pic:spPr>
+                </pic:pic>
+              </a:graphicData>
+            </a:graphic>
+          </wp:inline>
+        </w:drawing>
+      </w:r>
+    </w:p>
+    <w:p>
+      <w:pPr>
+        <w:rPr>
+          <w:u w:val="single"/>
+        </w:rPr>
+      </w:pPr>
+    </w:p>
+    <w:p>
+      <w:pPr>
+        <w:rPr>
+          <w:u w:val="single"/>
+        </w:rPr>
+      </w:pPr>
+      <w:r>
+        <w:rPr>
+          <w:u w:val="single"/>
+        </w:rPr>
+        <w:t>Clerk Login</w:t>
+      </w:r>
+    </w:p>
+    <w:p>
+      <w:pPr>
+        <w:rPr>
+          <w:u w:val="single"/>
+        </w:rPr>
+      </w:pPr>
+      <w:r>
+        <w:rPr>
+          <w:noProof/>
+          <w:u w:val="single"/>
+          <w:lang w:val="en-GB" w:eastAsia="en-GB"/>
+          <w14:ligatures w14:val="none"/>
+        </w:rPr>
+        <w:lastRenderedPageBreak/>
+        <w:drawing>
+          <wp:inline distT="0" distB="0" distL="0" distR="0">
+            <wp:extent cx="4686706" cy="5044877"/>
+            <wp:effectExtent l="0" t="0" r="0" b="3810"/>
+            <wp:docPr id="18" name="Picture 18"/>
+            <wp:cNvGraphicFramePr>
+              <a:graphicFrameLocks xmlns:a="http://schemas.openxmlformats.org/drawingml/2006/main" noChangeAspect="1"/>
+            </wp:cNvGraphicFramePr>
+            <a:graphic xmlns:a="http://schemas.openxmlformats.org/drawingml/2006/main">
+              <a:graphicData uri="http://schemas.openxmlformats.org/drawingml/2006/picture">
+                <pic:pic xmlns:pic="http://schemas.openxmlformats.org/drawingml/2006/picture">
+                  <pic:nvPicPr>
+                    <pic:cNvPr id="18" name="Screenshot 2026-06-11 095344.png"/>
+                    <pic:cNvPicPr/>
+                  </pic:nvPicPr>
+                  <pic:blipFill>
+                    <a:blip r:embed="rId24">
+                      <a:extLst>
+                        <a:ext uri="{28A0092B-C50C-407E-A947-70E740481C1C}">
+                          <a14:useLocalDpi xmlns:a14="http://schemas.microsoft.com/office/drawing/2010/main" val="0"/>
+                        </a:ext>
+                      </a:extLst>
+                    </a:blip>
+                    <a:stretch>
+                      <a:fillRect/>
+                    </a:stretch>
+                  </pic:blipFill>
+                  <pic:spPr>
+                    <a:xfrm>
+                      <a:off x="0" y="0"/>
+                      <a:ext cx="4686706" cy="5044877"/>
+                    </a:xfrm>
+                    <a:prstGeom prst="rect">
+                      <a:avLst/>
+                    </a:prstGeom>
+                  </pic:spPr>
+                </pic:pic>
+              </a:graphicData>
+            </a:graphic>
+          </wp:inline>
+        </w:drawing>
+      </w:r>
+    </w:p>
+    <w:p>
+      <w:pPr>
+        <w:rPr>
+          <w:u w:val="single"/>
+        </w:rPr>
+      </w:pPr>
+      <w:r>
+        <w:rPr>
+          <w:noProof/>
+          <w:u w:val="single"/>
+          <w:lang w:val="en-GB" w:eastAsia="en-GB"/>
+          <w14:ligatures w14:val="none"/>
+        </w:rPr>
+        <w:drawing>
+          <wp:inline distT="0" distB="0" distL="0" distR="0">
+            <wp:extent cx="5731510" cy="2705735"/>
+            <wp:effectExtent l="0" t="0" r="2540" b="0"/>
+            <wp:docPr id="19" name="Picture 19"/>
+            <wp:cNvGraphicFramePr>
+              <a:graphicFrameLocks xmlns:a="http://schemas.openxmlformats.org/drawingml/2006/main" noChangeAspect="1"/>
+            </wp:cNvGraphicFramePr>
+            <a:graphic xmlns:a="http://schemas.openxmlformats.org/drawingml/2006/main">
+              <a:graphicData uri="http://schemas.openxmlformats.org/drawingml/2006/picture">
+                <pic:pic xmlns:pic="http://schemas.openxmlformats.org/drawingml/2006/picture">
+                  <pic:nvPicPr>
+                    <pic:cNvPr id="19" name="Screenshot 2026-06-11 095406.png"/>
+                    <pic:cNvPicPr/>
+                  </pic:nvPicPr>
+                  <pic:blipFill>
+                    <a:blip r:embed="rId25">
+                      <a:extLst>
+                        <a:ext uri="{28A0092B-C50C-407E-A947-70E740481C1C}">
+                          <a14:useLocalDpi xmlns:a14="http://schemas.microsoft.com/office/drawing/2010/main" val="0"/>
+                        </a:ext>
+                      </a:extLst>
+                    </a:blip>
+                    <a:stretch>
+                      <a:fillRect/>
+                    </a:stretch>
+                  </pic:blipFill>
+                  <pic:spPr>
+                    <a:xfrm>
+                      <a:off x="0" y="0"/>
+                      <a:ext cx="5731510" cy="2705735"/>
+                    </a:xfrm>
+                    <a:prstGeom prst="rect">
+                      <a:avLst/>
+                    </a:prstGeom>
+                  </pic:spPr>
+                </pic:pic>
+              </a:graphicData>
+            </a:graphic>
+          </wp:inline>
+        </w:drawing>
+      </w:r>
+    </w:p>
+    <w:p>
+      <w:pPr>
+        <w:rPr>
+          <w:u w:val="single"/>
+        </w:rPr>
+      </w:pPr>
+      <w:r>
+        <w:rPr>
+          <w:u w:val="single"/>
+        </w:rPr>
+        <w:t>Manager Login</w:t>
+      </w:r>
+    </w:p>
+    <w:p>
+      <w:pPr>
+        <w:rPr>
+          <w:u w:val="single"/>
+        </w:rPr>
+      </w:pPr>
+      <w:r>
+        <w:rPr>
+          <w:noProof/>
+          <w:u w:val="single"/>
+          <w:lang w:val="en-GB" w:eastAsia="en-GB"/>
+          <w14:ligatures w14:val="none"/>
+        </w:rPr>
+        <w:lastRenderedPageBreak/>
+        <w:drawing>
+          <wp:inline distT="0" distB="0" distL="0" distR="0">
+            <wp:extent cx="5090601" cy="5692633"/>
+            <wp:effectExtent l="0" t="0" r="0" b="3810"/>
+            <wp:docPr id="20" name="Picture 20"/>
+            <wp:cNvGraphicFramePr>
+              <a:graphicFrameLocks xmlns:a="http://schemas.openxmlformats.org/drawingml/2006/main" noChangeAspect="1"/>
+            </wp:cNvGraphicFramePr>
+            <a:graphic xmlns:a="http://schemas.openxmlformats.org/drawingml/2006/main">
+              <a:graphicData uri="http://schemas.openxmlformats.org/drawingml/2006/picture">
+                <pic:pic xmlns:pic="http://schemas.openxmlformats.org/drawingml/2006/picture">
+                  <pic:nvPicPr>
+                    <pic:cNvPr id="20" name="Screenshot 2026-06-11 095436.png"/>
+                    <pic:cNvPicPr/>
+                  </pic:nvPicPr>
+                  <pic:blipFill>
+                    <a:blip r:embed="rId26">
+                      <a:extLst>
+                        <a:ext uri="{28A0092B-C50C-407E-A947-70E740481C1C}">
+                          <a14:useLocalDpi xmlns:a14="http://schemas.microsoft.com/office/drawing/2010/main" val="0"/>
+                        </a:ext>
+                      </a:extLst>
+                    </a:blip>
+                    <a:stretch>
+                      <a:fillRect/>
+                    </a:stretch>
+                  </pic:blipFill>
+                  <pic:spPr>
+                    <a:xfrm>
+                      <a:off x="0" y="0"/>
+                      <a:ext cx="5090601" cy="5692633"/>
+                    </a:xfrm>
+                    <a:prstGeom prst="rect">
+                      <a:avLst/>
+                    </a:prstGeom>
+                  </pic:spPr>
+                </pic:pic>
+              </a:graphicData>
+            </a:graphic>
+          </wp:inline>
+        </w:drawing>
+      </w:r>
+    </w:p>
+    <w:p>
+      <w:pPr>
+        <w:rPr>
+          <w:u w:val="single"/>
+        </w:rPr>
+      </w:pPr>
+      <w:r>
+        <w:rPr>
+          <w:noProof/>
+          <w:u w:val="single"/>
+          <w:lang w:val="en-GB" w:eastAsia="en-GB"/>
+          <w14:ligatures w14:val="none"/>
+        </w:rPr>
+        <w:drawing>
+          <wp:inline distT="0" distB="0" distL="0" distR="0">
+            <wp:extent cx="5731510" cy="2392680"/>
+            <wp:effectExtent l="0" t="0" r="2540" b="7620"/>
+            <wp:docPr id="21" name="Picture 21"/>
+            <wp:cNvGraphicFramePr>
+              <a:graphicFrameLocks xmlns:a="http://schemas.openxmlformats.org/drawingml/2006/main" noChangeAspect="1"/>
+            </wp:cNvGraphicFramePr>
+            <a:graphic xmlns:a="http://schemas.openxmlformats.org/drawingml/2006/main">
+              <a:graphicData uri="http://schemas.openxmlformats.org/drawingml/2006/picture">
+                <pic:pic xmlns:pic="http://schemas.openxmlformats.org/drawingml/2006/picture">
+                  <pic:nvPicPr>
+                    <pic:cNvPr id="21" name="Screenshot 2026-06-11 095502.png"/>
+                    <pic:cNvPicPr/>
+                  </pic:nvPicPr>
+                  <pic:blipFill>
+                    <a:blip r:embed="rId27">
+                      <a:extLst>
+                        <a:ext uri="{28A0092B-C50C-407E-A947-70E740481C1C}">
+                          <a14:useLocalDpi xmlns:a14="http://schemas.microsoft.com/office/drawing/2010/main" val="0"/>
+                        </a:ext>
+                      </a:extLst>
+                    </a:blip>
+                    <a:stretch>
+                      <a:fillRect/>
+                    </a:stretch>
+                  </pic:blipFill>
+                  <pic:spPr>
+                    <a:xfrm>
+                      <a:off x="0" y="0"/>
+                      <a:ext cx="5731510" cy="2392680"/>
+                    </a:xfrm>
+                    <a:prstGeom prst="rect">
+                      <a:avLst/>
+                    </a:prstGeom>
+                  </pic:spPr>
+                </pic:pic>
+              </a:graphicData>
+            </a:graphic>
+          </wp:inline>
+        </w:drawing>
+      </w:r>
+    </w:p>
+    <w:p/>
+    <w:p>
+      <w:pPr>
+        <w:pStyle w:val="Heading1"/>
+      </w:pPr>
+      <w:r>
+        <w:lastRenderedPageBreak/>
+        <w:t>Student Reflection</w:t>
+      </w:r>
+    </w:p>
+    <w:p>
+      <w:r>
+        <w:t>Week 4 focused on server-side authentication and session management for the Wan Shoes inventory system. I implemented a role-based login system that authenticates users against the admins and employees tables using mysqli_</w:t>
+      </w:r>
+      <w:proofErr w:type="gramStart"/>
+      <w:r>
+        <w:t>query(</w:t>
+      </w:r>
+      <w:proofErr w:type="gramEnd"/>
+      <w:r>
+        <w:t>), then establishes sessions storing user_id, name, and role. The admin dashboard displays dynamic statistics calculated via SQL aggregate functions including </w:t>
+      </w:r>
+      <w:proofErr w:type="gramStart"/>
+      <w:r>
+        <w:t>SUM(</w:t>
+      </w:r>
+      <w:proofErr w:type="gramEnd"/>
+      <w:r>
+        <w:t>stock_quantity * price) for inventory valuation showing total stock worth in KSH, and COUNT(*) for products and staff totals. Role-based redirection sends admins to admin.php while employees go to dashboard.php, where menu options differ for clerks (sales recording) versus stock managers (inventory addition). Session validation using isset($_SESSION['role']) is applied to all restricted pages, redirecting unauthenticated users to login.php. Logout functionality destroys sessions using session_</w:t>
+      </w:r>
+      <w:proofErr w:type="gramStart"/>
+      <w:r>
+        <w:t>destroy(</w:t>
+      </w:r>
+      <w:proofErr w:type="gramEnd"/>
+      <w:r>
+        <w:t>). The folder structure maintains separation of concerns with CSS, JavaScript, and PHP controllers organized logically, demonstrating professional web development practices.</w:t>
       </w:r>
       <w:bookmarkStart w:id="15" w:name="_GoBack"/>
       <w:bookmarkEnd w:id="15"/>
-      <w:r>
-        <w:t xml:space="preserve"> These foundational skills enable form processing, user authentication, and database integration for Weeks 4-5.</w:t>
-      </w:r>
     </w:p>
     <w:p/>
     <w:sectPr>
@@ -4653,7 +5129,7 @@
 </file>
 
 <file path=customXml/itemProps1.xml><?xml version="1.0" encoding="utf-8"?>
-<ds:datastoreItem xmlns:ds="http://schemas.openxmlformats.org/officeDocument/2006/customXml" ds:itemID="{FE6C559B-F2E5-49FE-8C9D-EE7BB9130C31}">
+<ds:datastoreItem xmlns:ds="http://schemas.openxmlformats.org/officeDocument/2006/customXml" ds:itemID="{0E4B3231-0F7E-4DAB-8801-AAA49AC4DA0D}">
   <ds:schemaRefs>
     <ds:schemaRef ds:uri="http://schemas.openxmlformats.org/officeDocument/2006/bibliography"/>
   </ds:schemaRefs>

</xml_diff>

<commit_message>
Completed documentation of the logbook
</commit_message>
<xml_diff>
--- a/LOGBOOK.docx
+++ b/LOGBOOK.docx
@@ -307,14 +307,136 @@
           <w:r>
             <w:fldChar w:fldCharType="separate"/>
           </w:r>
-          <w:hyperlink w:anchor="_Toc232049296" w:history="1">
+          <w:bookmarkStart w:id="0" w:name="_GoBack"/>
+          <w:bookmarkEnd w:id="0"/>
+          <w:r>
+            <w:rPr>
+              <w:rStyle w:val="Hyperlink"/>
+              <w:noProof/>
+            </w:rPr>
+            <w:fldChar w:fldCharType="begin"/>
+          </w:r>
+          <w:r>
+            <w:rPr>
+              <w:rStyle w:val="Hyperlink"/>
+              <w:noProof/>
+            </w:rPr>
+            <w:instrText xml:space="preserve"> </w:instrText>
+          </w:r>
+          <w:r>
+            <w:rPr>
+              <w:noProof/>
+            </w:rPr>
+            <w:instrText>HYPERLINK \l "_Toc232065447"</w:instrText>
+          </w:r>
+          <w:r>
+            <w:rPr>
+              <w:rStyle w:val="Hyperlink"/>
+              <w:noProof/>
+            </w:rPr>
+            <w:instrText xml:space="preserve"> </w:instrText>
+          </w:r>
+          <w:r>
+            <w:rPr>
+              <w:rStyle w:val="Hyperlink"/>
+              <w:noProof/>
+            </w:rPr>
+          </w:r>
+          <w:r>
+            <w:rPr>
+              <w:rStyle w:val="Hyperlink"/>
+              <w:noProof/>
+            </w:rPr>
+            <w:fldChar w:fldCharType="separate"/>
+          </w:r>
+          <w:r>
+            <w:rPr>
+              <w:rStyle w:val="Hyperlink"/>
+              <w:noProof/>
+              <w:lang w:val="en-GB"/>
+            </w:rPr>
+            <w:t>WEEK 1 CHECKLIST</w:t>
+          </w:r>
+          <w:r>
+            <w:rPr>
+              <w:noProof/>
+              <w:webHidden/>
+            </w:rPr>
+            <w:tab/>
+          </w:r>
+          <w:r>
+            <w:rPr>
+              <w:noProof/>
+              <w:webHidden/>
+            </w:rPr>
+            <w:fldChar w:fldCharType="begin"/>
+          </w:r>
+          <w:r>
+            <w:rPr>
+              <w:noProof/>
+              <w:webHidden/>
+            </w:rPr>
+            <w:instrText xml:space="preserve"> PAGEREF _Toc232065447 \h </w:instrText>
+          </w:r>
+          <w:r>
+            <w:rPr>
+              <w:noProof/>
+              <w:webHidden/>
+            </w:rPr>
+          </w:r>
+          <w:r>
+            <w:rPr>
+              <w:noProof/>
+              <w:webHidden/>
+            </w:rPr>
+            <w:fldChar w:fldCharType="separate"/>
+          </w:r>
+          <w:r>
+            <w:rPr>
+              <w:noProof/>
+              <w:webHidden/>
+            </w:rPr>
+            <w:t>3</w:t>
+          </w:r>
+          <w:r>
+            <w:rPr>
+              <w:noProof/>
+              <w:webHidden/>
+            </w:rPr>
+            <w:fldChar w:fldCharType="end"/>
+          </w:r>
+          <w:r>
+            <w:rPr>
+              <w:rStyle w:val="Hyperlink"/>
+              <w:noProof/>
+            </w:rPr>
+            <w:fldChar w:fldCharType="end"/>
+          </w:r>
+        </w:p>
+        <w:p>
+          <w:pPr>
+            <w:pStyle w:val="TOC2"/>
+            <w:tabs>
+              <w:tab w:val="right" w:leader="dot" w:pos="9016"/>
+            </w:tabs>
+            <w:rPr>
+              <w:rFonts w:eastAsiaTheme="minorEastAsia"/>
+              <w:noProof/>
+              <w:kern w:val="0"/>
+              <w:sz w:val="22"/>
+              <w:szCs w:val="22"/>
+              <w:lang w:val="en-GB" w:eastAsia="en-GB"/>
+              <w14:ligatures w14:val="none"/>
+            </w:rPr>
+          </w:pPr>
+          <w:hyperlink w:anchor="_Toc232065448" w:history="1">
             <w:r>
               <w:rPr>
                 <w:rStyle w:val="Hyperlink"/>
                 <w:noProof/>
                 <w:lang w:val="en-GB"/>
               </w:rPr>
-              <w:t>WEEK 1 CHECKLIST</w:t>
+              <w:t>Fig 1.1</w:t>
             </w:r>
             <w:r>
               <w:rPr>
@@ -335,7 +457,7 @@
                 <w:noProof/>
                 <w:webHidden/>
               </w:rPr>
-              <w:instrText xml:space="preserve"> PAGEREF _Toc232049296 \h </w:instrText>
+              <w:instrText xml:space="preserve"> PAGEREF _Toc232065448 \h </w:instrText>
             </w:r>
             <w:r>
               <w:rPr>
@@ -382,14 +504,14 @@
               <w14:ligatures w14:val="none"/>
             </w:rPr>
           </w:pPr>
-          <w:hyperlink w:anchor="_Toc232049297" w:history="1">
+          <w:hyperlink w:anchor="_Toc232065449" w:history="1">
             <w:r>
               <w:rPr>
                 <w:rStyle w:val="Hyperlink"/>
                 <w:noProof/>
                 <w:lang w:val="en-GB"/>
               </w:rPr>
-              <w:t>Fig 1.1</w:t>
+              <w:t>Fig 1.2:</w:t>
             </w:r>
             <w:r>
               <w:rPr>
@@ -410,7 +532,7 @@
                 <w:noProof/>
                 <w:webHidden/>
               </w:rPr>
-              <w:instrText xml:space="preserve"> PAGEREF _Toc232049297 \h </w:instrText>
+              <w:instrText xml:space="preserve"> PAGEREF _Toc232065449 \h </w:instrText>
             </w:r>
             <w:r>
               <w:rPr>
@@ -457,14 +579,13 @@
               <w14:ligatures w14:val="none"/>
             </w:rPr>
           </w:pPr>
-          <w:hyperlink w:anchor="_Toc232049298" w:history="1">
+          <w:hyperlink w:anchor="_Toc232065450" w:history="1">
             <w:r>
               <w:rPr>
                 <w:rStyle w:val="Hyperlink"/>
                 <w:noProof/>
-                <w:lang w:val="en-GB"/>
-              </w:rPr>
-              <w:t>Fig 1.2:</w:t>
+              </w:rPr>
+              <w:t>Fig 1.3</w:t>
             </w:r>
             <w:r>
               <w:rPr>
@@ -485,7 +606,7 @@
                 <w:noProof/>
                 <w:webHidden/>
               </w:rPr>
-              <w:instrText xml:space="preserve"> PAGEREF _Toc232049298 \h </w:instrText>
+              <w:instrText xml:space="preserve"> PAGEREF _Toc232065450 \h </w:instrText>
             </w:r>
             <w:r>
               <w:rPr>
@@ -505,7 +626,7 @@
                 <w:noProof/>
                 <w:webHidden/>
               </w:rPr>
-              <w:t>3</w:t>
+              <w:t>4</w:t>
             </w:r>
             <w:r>
               <w:rPr>
@@ -532,13 +653,13 @@
               <w14:ligatures w14:val="none"/>
             </w:rPr>
           </w:pPr>
-          <w:hyperlink w:anchor="_Toc232049299" w:history="1">
+          <w:hyperlink w:anchor="_Toc232065451" w:history="1">
             <w:r>
               <w:rPr>
                 <w:rStyle w:val="Hyperlink"/>
                 <w:noProof/>
               </w:rPr>
-              <w:t>Fig 1.3</w:t>
+              <w:t>Fig 1.4</w:t>
             </w:r>
             <w:r>
               <w:rPr>
@@ -559,7 +680,7 @@
                 <w:noProof/>
                 <w:webHidden/>
               </w:rPr>
-              <w:instrText xml:space="preserve"> PAGEREF _Toc232049299 \h </w:instrText>
+              <w:instrText xml:space="preserve"> PAGEREF _Toc232065451 \h </w:instrText>
             </w:r>
             <w:r>
               <w:rPr>
@@ -579,7 +700,7 @@
                 <w:noProof/>
                 <w:webHidden/>
               </w:rPr>
-              <w:t>4</w:t>
+              <w:t>5</w:t>
             </w:r>
             <w:r>
               <w:rPr>
@@ -606,13 +727,13 @@
               <w14:ligatures w14:val="none"/>
             </w:rPr>
           </w:pPr>
-          <w:hyperlink w:anchor="_Toc232049300" w:history="1">
+          <w:hyperlink w:anchor="_Toc232065452" w:history="1">
             <w:r>
               <w:rPr>
                 <w:rStyle w:val="Hyperlink"/>
                 <w:noProof/>
               </w:rPr>
-              <w:t>Fig 1.4</w:t>
+              <w:t>Fig 1.5</w:t>
             </w:r>
             <w:r>
               <w:rPr>
@@ -633,7 +754,7 @@
                 <w:noProof/>
                 <w:webHidden/>
               </w:rPr>
-              <w:instrText xml:space="preserve"> PAGEREF _Toc232049300 \h </w:instrText>
+              <w:instrText xml:space="preserve"> PAGEREF _Toc232065452 \h </w:instrText>
             </w:r>
             <w:r>
               <w:rPr>
@@ -680,13 +801,13 @@
               <w14:ligatures w14:val="none"/>
             </w:rPr>
           </w:pPr>
-          <w:hyperlink w:anchor="_Toc232049301" w:history="1">
+          <w:hyperlink w:anchor="_Toc232065453" w:history="1">
             <w:r>
               <w:rPr>
                 <w:rStyle w:val="Hyperlink"/>
                 <w:noProof/>
               </w:rPr>
-              <w:t>Fig 1.5</w:t>
+              <w:t>Fig 1.6</w:t>
             </w:r>
             <w:r>
               <w:rPr>
@@ -707,7 +828,7 @@
                 <w:noProof/>
                 <w:webHidden/>
               </w:rPr>
-              <w:instrText xml:space="preserve"> PAGEREF _Toc232049301 \h </w:instrText>
+              <w:instrText xml:space="preserve"> PAGEREF _Toc232065453 \h </w:instrText>
             </w:r>
             <w:r>
               <w:rPr>
@@ -727,7 +848,7 @@
                 <w:noProof/>
                 <w:webHidden/>
               </w:rPr>
-              <w:t>5</w:t>
+              <w:t>6</w:t>
             </w:r>
             <w:r>
               <w:rPr>
@@ -754,13 +875,14 @@
               <w14:ligatures w14:val="none"/>
             </w:rPr>
           </w:pPr>
-          <w:hyperlink w:anchor="_Toc232049302" w:history="1">
+          <w:hyperlink w:anchor="_Toc232065454" w:history="1">
             <w:r>
               <w:rPr>
                 <w:rStyle w:val="Hyperlink"/>
                 <w:noProof/>
-              </w:rPr>
-              <w:t>Fig 1.6</w:t>
+                <w:lang w:val="en-GB"/>
+              </w:rPr>
+              <w:t>Week 1 Student Reflection</w:t>
             </w:r>
             <w:r>
               <w:rPr>
@@ -781,7 +903,7 @@
                 <w:noProof/>
                 <w:webHidden/>
               </w:rPr>
-              <w:instrText xml:space="preserve"> PAGEREF _Toc232049302 \h </w:instrText>
+              <w:instrText xml:space="preserve"> PAGEREF _Toc232065454 \h </w:instrText>
             </w:r>
             <w:r>
               <w:rPr>
@@ -801,7 +923,81 @@
                 <w:noProof/>
                 <w:webHidden/>
               </w:rPr>
-              <w:t>6</w:t>
+              <w:t>7</w:t>
+            </w:r>
+            <w:r>
+              <w:rPr>
+                <w:noProof/>
+                <w:webHidden/>
+              </w:rPr>
+              <w:fldChar w:fldCharType="end"/>
+            </w:r>
+          </w:hyperlink>
+        </w:p>
+        <w:p>
+          <w:pPr>
+            <w:pStyle w:val="TOC1"/>
+            <w:tabs>
+              <w:tab w:val="right" w:leader="dot" w:pos="9016"/>
+            </w:tabs>
+            <w:rPr>
+              <w:rFonts w:eastAsiaTheme="minorEastAsia"/>
+              <w:noProof/>
+              <w:kern w:val="0"/>
+              <w:sz w:val="22"/>
+              <w:szCs w:val="22"/>
+              <w:lang w:val="en-GB" w:eastAsia="en-GB"/>
+              <w14:ligatures w14:val="none"/>
+            </w:rPr>
+          </w:pPr>
+          <w:hyperlink w:anchor="_Toc232065455" w:history="1">
+            <w:r>
+              <w:rPr>
+                <w:rStyle w:val="Hyperlink"/>
+                <w:noProof/>
+              </w:rPr>
+              <w:t>WEEK 2</w:t>
+            </w:r>
+            <w:r>
+              <w:rPr>
+                <w:noProof/>
+                <w:webHidden/>
+              </w:rPr>
+              <w:tab/>
+            </w:r>
+            <w:r>
+              <w:rPr>
+                <w:noProof/>
+                <w:webHidden/>
+              </w:rPr>
+              <w:fldChar w:fldCharType="begin"/>
+            </w:r>
+            <w:r>
+              <w:rPr>
+                <w:noProof/>
+                <w:webHidden/>
+              </w:rPr>
+              <w:instrText xml:space="preserve"> PAGEREF _Toc232065455 \h </w:instrText>
+            </w:r>
+            <w:r>
+              <w:rPr>
+                <w:noProof/>
+                <w:webHidden/>
+              </w:rPr>
+            </w:r>
+            <w:r>
+              <w:rPr>
+                <w:noProof/>
+                <w:webHidden/>
+              </w:rPr>
+              <w:fldChar w:fldCharType="separate"/>
+            </w:r>
+            <w:r>
+              <w:rPr>
+                <w:noProof/>
+                <w:webHidden/>
+              </w:rPr>
+              <w:t>7</w:t>
             </w:r>
             <w:r>
               <w:rPr>
@@ -828,14 +1024,384 @@
               <w14:ligatures w14:val="none"/>
             </w:rPr>
           </w:pPr>
-          <w:hyperlink w:anchor="_Toc232049303" w:history="1">
+          <w:hyperlink w:anchor="_Toc232065456" w:history="1">
             <w:r>
               <w:rPr>
                 <w:rStyle w:val="Hyperlink"/>
                 <w:noProof/>
+              </w:rPr>
+              <w:t>Fig 2.1</w:t>
+            </w:r>
+            <w:r>
+              <w:rPr>
+                <w:noProof/>
+                <w:webHidden/>
+              </w:rPr>
+              <w:tab/>
+            </w:r>
+            <w:r>
+              <w:rPr>
+                <w:noProof/>
+                <w:webHidden/>
+              </w:rPr>
+              <w:fldChar w:fldCharType="begin"/>
+            </w:r>
+            <w:r>
+              <w:rPr>
+                <w:noProof/>
+                <w:webHidden/>
+              </w:rPr>
+              <w:instrText xml:space="preserve"> PAGEREF _Toc232065456 \h </w:instrText>
+            </w:r>
+            <w:r>
+              <w:rPr>
+                <w:noProof/>
+                <w:webHidden/>
+              </w:rPr>
+            </w:r>
+            <w:r>
+              <w:rPr>
+                <w:noProof/>
+                <w:webHidden/>
+              </w:rPr>
+              <w:fldChar w:fldCharType="separate"/>
+            </w:r>
+            <w:r>
+              <w:rPr>
+                <w:noProof/>
+                <w:webHidden/>
+              </w:rPr>
+              <w:t>7</w:t>
+            </w:r>
+            <w:r>
+              <w:rPr>
+                <w:noProof/>
+                <w:webHidden/>
+              </w:rPr>
+              <w:fldChar w:fldCharType="end"/>
+            </w:r>
+          </w:hyperlink>
+        </w:p>
+        <w:p>
+          <w:pPr>
+            <w:pStyle w:val="TOC2"/>
+            <w:tabs>
+              <w:tab w:val="right" w:leader="dot" w:pos="9016"/>
+            </w:tabs>
+            <w:rPr>
+              <w:rFonts w:eastAsiaTheme="minorEastAsia"/>
+              <w:noProof/>
+              <w:kern w:val="0"/>
+              <w:sz w:val="22"/>
+              <w:szCs w:val="22"/>
+              <w:lang w:val="en-GB" w:eastAsia="en-GB"/>
+              <w14:ligatures w14:val="none"/>
+            </w:rPr>
+          </w:pPr>
+          <w:hyperlink w:anchor="_Toc232065457" w:history="1">
+            <w:r>
+              <w:rPr>
+                <w:rStyle w:val="Hyperlink"/>
+                <w:noProof/>
+              </w:rPr>
+              <w:t>Fig 2.2</w:t>
+            </w:r>
+            <w:r>
+              <w:rPr>
+                <w:noProof/>
+                <w:webHidden/>
+              </w:rPr>
+              <w:tab/>
+            </w:r>
+            <w:r>
+              <w:rPr>
+                <w:noProof/>
+                <w:webHidden/>
+              </w:rPr>
+              <w:fldChar w:fldCharType="begin"/>
+            </w:r>
+            <w:r>
+              <w:rPr>
+                <w:noProof/>
+                <w:webHidden/>
+              </w:rPr>
+              <w:instrText xml:space="preserve"> PAGEREF _Toc232065457 \h </w:instrText>
+            </w:r>
+            <w:r>
+              <w:rPr>
+                <w:noProof/>
+                <w:webHidden/>
+              </w:rPr>
+            </w:r>
+            <w:r>
+              <w:rPr>
+                <w:noProof/>
+                <w:webHidden/>
+              </w:rPr>
+              <w:fldChar w:fldCharType="separate"/>
+            </w:r>
+            <w:r>
+              <w:rPr>
+                <w:noProof/>
+                <w:webHidden/>
+              </w:rPr>
+              <w:t>8</w:t>
+            </w:r>
+            <w:r>
+              <w:rPr>
+                <w:noProof/>
+                <w:webHidden/>
+              </w:rPr>
+              <w:fldChar w:fldCharType="end"/>
+            </w:r>
+          </w:hyperlink>
+        </w:p>
+        <w:p>
+          <w:pPr>
+            <w:pStyle w:val="TOC2"/>
+            <w:tabs>
+              <w:tab w:val="right" w:leader="dot" w:pos="9016"/>
+            </w:tabs>
+            <w:rPr>
+              <w:rFonts w:eastAsiaTheme="minorEastAsia"/>
+              <w:noProof/>
+              <w:kern w:val="0"/>
+              <w:sz w:val="22"/>
+              <w:szCs w:val="22"/>
+              <w:lang w:val="en-GB" w:eastAsia="en-GB"/>
+              <w14:ligatures w14:val="none"/>
+            </w:rPr>
+          </w:pPr>
+          <w:hyperlink w:anchor="_Toc232065458" w:history="1">
+            <w:r>
+              <w:rPr>
+                <w:rStyle w:val="Hyperlink"/>
+                <w:noProof/>
+              </w:rPr>
+              <w:t>Fig 2.3</w:t>
+            </w:r>
+            <w:r>
+              <w:rPr>
+                <w:noProof/>
+                <w:webHidden/>
+              </w:rPr>
+              <w:tab/>
+            </w:r>
+            <w:r>
+              <w:rPr>
+                <w:noProof/>
+                <w:webHidden/>
+              </w:rPr>
+              <w:fldChar w:fldCharType="begin"/>
+            </w:r>
+            <w:r>
+              <w:rPr>
+                <w:noProof/>
+                <w:webHidden/>
+              </w:rPr>
+              <w:instrText xml:space="preserve"> PAGEREF _Toc232065458 \h </w:instrText>
+            </w:r>
+            <w:r>
+              <w:rPr>
+                <w:noProof/>
+                <w:webHidden/>
+              </w:rPr>
+            </w:r>
+            <w:r>
+              <w:rPr>
+                <w:noProof/>
+                <w:webHidden/>
+              </w:rPr>
+              <w:fldChar w:fldCharType="separate"/>
+            </w:r>
+            <w:r>
+              <w:rPr>
+                <w:noProof/>
+                <w:webHidden/>
+              </w:rPr>
+              <w:t>9</w:t>
+            </w:r>
+            <w:r>
+              <w:rPr>
+                <w:noProof/>
+                <w:webHidden/>
+              </w:rPr>
+              <w:fldChar w:fldCharType="end"/>
+            </w:r>
+          </w:hyperlink>
+        </w:p>
+        <w:p>
+          <w:pPr>
+            <w:pStyle w:val="TOC2"/>
+            <w:tabs>
+              <w:tab w:val="right" w:leader="dot" w:pos="9016"/>
+            </w:tabs>
+            <w:rPr>
+              <w:rFonts w:eastAsiaTheme="minorEastAsia"/>
+              <w:noProof/>
+              <w:kern w:val="0"/>
+              <w:sz w:val="22"/>
+              <w:szCs w:val="22"/>
+              <w:lang w:val="en-GB" w:eastAsia="en-GB"/>
+              <w14:ligatures w14:val="none"/>
+            </w:rPr>
+          </w:pPr>
+          <w:hyperlink w:anchor="_Toc232065459" w:history="1">
+            <w:r>
+              <w:rPr>
+                <w:rStyle w:val="Hyperlink"/>
+                <w:noProof/>
+              </w:rPr>
+              <w:t>FIG 2.4</w:t>
+            </w:r>
+            <w:r>
+              <w:rPr>
+                <w:noProof/>
+                <w:webHidden/>
+              </w:rPr>
+              <w:tab/>
+            </w:r>
+            <w:r>
+              <w:rPr>
+                <w:noProof/>
+                <w:webHidden/>
+              </w:rPr>
+              <w:fldChar w:fldCharType="begin"/>
+            </w:r>
+            <w:r>
+              <w:rPr>
+                <w:noProof/>
+                <w:webHidden/>
+              </w:rPr>
+              <w:instrText xml:space="preserve"> PAGEREF _Toc232065459 \h </w:instrText>
+            </w:r>
+            <w:r>
+              <w:rPr>
+                <w:noProof/>
+                <w:webHidden/>
+              </w:rPr>
+            </w:r>
+            <w:r>
+              <w:rPr>
+                <w:noProof/>
+                <w:webHidden/>
+              </w:rPr>
+              <w:fldChar w:fldCharType="separate"/>
+            </w:r>
+            <w:r>
+              <w:rPr>
+                <w:noProof/>
+                <w:webHidden/>
+              </w:rPr>
+              <w:t>10</w:t>
+            </w:r>
+            <w:r>
+              <w:rPr>
+                <w:noProof/>
+                <w:webHidden/>
+              </w:rPr>
+              <w:fldChar w:fldCharType="end"/>
+            </w:r>
+          </w:hyperlink>
+        </w:p>
+        <w:p>
+          <w:pPr>
+            <w:pStyle w:val="TOC2"/>
+            <w:tabs>
+              <w:tab w:val="right" w:leader="dot" w:pos="9016"/>
+            </w:tabs>
+            <w:rPr>
+              <w:rFonts w:eastAsiaTheme="minorEastAsia"/>
+              <w:noProof/>
+              <w:kern w:val="0"/>
+              <w:sz w:val="22"/>
+              <w:szCs w:val="22"/>
+              <w:lang w:val="en-GB" w:eastAsia="en-GB"/>
+              <w14:ligatures w14:val="none"/>
+            </w:rPr>
+          </w:pPr>
+          <w:hyperlink w:anchor="_Toc232065460" w:history="1">
+            <w:r>
+              <w:rPr>
+                <w:rStyle w:val="Hyperlink"/>
+                <w:noProof/>
+              </w:rPr>
+              <w:t>WEEK 2 REFLECTION</w:t>
+            </w:r>
+            <w:r>
+              <w:rPr>
+                <w:noProof/>
+                <w:webHidden/>
+              </w:rPr>
+              <w:tab/>
+            </w:r>
+            <w:r>
+              <w:rPr>
+                <w:noProof/>
+                <w:webHidden/>
+              </w:rPr>
+              <w:fldChar w:fldCharType="begin"/>
+            </w:r>
+            <w:r>
+              <w:rPr>
+                <w:noProof/>
+                <w:webHidden/>
+              </w:rPr>
+              <w:instrText xml:space="preserve"> PAGEREF _Toc232065460 \h </w:instrText>
+            </w:r>
+            <w:r>
+              <w:rPr>
+                <w:noProof/>
+                <w:webHidden/>
+              </w:rPr>
+            </w:r>
+            <w:r>
+              <w:rPr>
+                <w:noProof/>
+                <w:webHidden/>
+              </w:rPr>
+              <w:fldChar w:fldCharType="separate"/>
+            </w:r>
+            <w:r>
+              <w:rPr>
+                <w:noProof/>
+                <w:webHidden/>
+              </w:rPr>
+              <w:t>11</w:t>
+            </w:r>
+            <w:r>
+              <w:rPr>
+                <w:noProof/>
+                <w:webHidden/>
+              </w:rPr>
+              <w:fldChar w:fldCharType="end"/>
+            </w:r>
+          </w:hyperlink>
+        </w:p>
+        <w:p>
+          <w:pPr>
+            <w:pStyle w:val="TOC2"/>
+            <w:tabs>
+              <w:tab w:val="right" w:leader="dot" w:pos="9016"/>
+            </w:tabs>
+            <w:rPr>
+              <w:rFonts w:eastAsiaTheme="minorEastAsia"/>
+              <w:noProof/>
+              <w:kern w:val="0"/>
+              <w:sz w:val="22"/>
+              <w:szCs w:val="22"/>
+              <w:lang w:val="en-GB" w:eastAsia="en-GB"/>
+              <w14:ligatures w14:val="none"/>
+            </w:rPr>
+          </w:pPr>
+          <w:hyperlink w:anchor="_Toc232065461" w:history="1">
+            <w:r>
+              <w:rPr>
+                <w:rStyle w:val="Hyperlink"/>
+                <w:noProof/>
                 <w:lang w:val="en-GB"/>
               </w:rPr>
-              <w:t>Week 1 Student Reflection</w:t>
+              <w:t>Project Proposal Summary</w:t>
             </w:r>
             <w:r>
               <w:rPr>
@@ -856,7 +1422,7 @@
                 <w:noProof/>
                 <w:webHidden/>
               </w:rPr>
-              <w:instrText xml:space="preserve"> PAGEREF _Toc232049303 \h </w:instrText>
+              <w:instrText xml:space="preserve"> PAGEREF _Toc232065461 \h </w:instrText>
             </w:r>
             <w:r>
               <w:rPr>
@@ -876,7 +1442,7 @@
                 <w:noProof/>
                 <w:webHidden/>
               </w:rPr>
-              <w:t>7</w:t>
+              <w:t>11</w:t>
             </w:r>
             <w:r>
               <w:rPr>
@@ -903,13 +1469,13 @@
               <w14:ligatures w14:val="none"/>
             </w:rPr>
           </w:pPr>
-          <w:hyperlink w:anchor="_Toc232049304" w:history="1">
+          <w:hyperlink w:anchor="_Toc232065462" w:history="1">
             <w:r>
               <w:rPr>
                 <w:rStyle w:val="Hyperlink"/>
                 <w:noProof/>
               </w:rPr>
-              <w:t>WEEK 2</w:t>
+              <w:t>WEEK 3</w:t>
             </w:r>
             <w:r>
               <w:rPr>
@@ -930,7 +1496,7 @@
                 <w:noProof/>
                 <w:webHidden/>
               </w:rPr>
-              <w:instrText xml:space="preserve"> PAGEREF _Toc232049304 \h </w:instrText>
+              <w:instrText xml:space="preserve"> PAGEREF _Toc232065462 \h </w:instrText>
             </w:r>
             <w:r>
               <w:rPr>
@@ -950,7 +1516,7 @@
                 <w:noProof/>
                 <w:webHidden/>
               </w:rPr>
-              <w:t>7</w:t>
+              <w:t>12</w:t>
             </w:r>
             <w:r>
               <w:rPr>
@@ -977,13 +1543,13 @@
               <w14:ligatures w14:val="none"/>
             </w:rPr>
           </w:pPr>
-          <w:hyperlink w:anchor="_Toc232049305" w:history="1">
+          <w:hyperlink w:anchor="_Toc232065463" w:history="1">
             <w:r>
               <w:rPr>
                 <w:rStyle w:val="Hyperlink"/>
                 <w:noProof/>
               </w:rPr>
-              <w:t>Fig 2.1</w:t>
+              <w:t>Javascript and PHP Basics</w:t>
             </w:r>
             <w:r>
               <w:rPr>
@@ -1004,7 +1570,7 @@
                 <w:noProof/>
                 <w:webHidden/>
               </w:rPr>
-              <w:instrText xml:space="preserve"> PAGEREF _Toc232049305 \h </w:instrText>
+              <w:instrText xml:space="preserve"> PAGEREF _Toc232065463 \h </w:instrText>
             </w:r>
             <w:r>
               <w:rPr>
@@ -1024,7 +1590,229 @@
                 <w:noProof/>
                 <w:webHidden/>
               </w:rPr>
-              <w:t>7</w:t>
+              <w:t>12</w:t>
+            </w:r>
+            <w:r>
+              <w:rPr>
+                <w:noProof/>
+                <w:webHidden/>
+              </w:rPr>
+              <w:fldChar w:fldCharType="end"/>
+            </w:r>
+          </w:hyperlink>
+        </w:p>
+        <w:p>
+          <w:pPr>
+            <w:pStyle w:val="TOC1"/>
+            <w:tabs>
+              <w:tab w:val="right" w:leader="dot" w:pos="9016"/>
+            </w:tabs>
+            <w:rPr>
+              <w:rFonts w:eastAsiaTheme="minorEastAsia"/>
+              <w:noProof/>
+              <w:kern w:val="0"/>
+              <w:sz w:val="22"/>
+              <w:szCs w:val="22"/>
+              <w:lang w:val="en-GB" w:eastAsia="en-GB"/>
+              <w14:ligatures w14:val="none"/>
+            </w:rPr>
+          </w:pPr>
+          <w:hyperlink w:anchor="_Toc232065464" w:history="1">
+            <w:r>
+              <w:rPr>
+                <w:rStyle w:val="Hyperlink"/>
+                <w:noProof/>
+              </w:rPr>
+              <w:t>WEEK 4 Server Side Components and Backend Development</w:t>
+            </w:r>
+            <w:r>
+              <w:rPr>
+                <w:noProof/>
+                <w:webHidden/>
+              </w:rPr>
+              <w:tab/>
+            </w:r>
+            <w:r>
+              <w:rPr>
+                <w:noProof/>
+                <w:webHidden/>
+              </w:rPr>
+              <w:fldChar w:fldCharType="begin"/>
+            </w:r>
+            <w:r>
+              <w:rPr>
+                <w:noProof/>
+                <w:webHidden/>
+              </w:rPr>
+              <w:instrText xml:space="preserve"> PAGEREF _Toc232065464 \h </w:instrText>
+            </w:r>
+            <w:r>
+              <w:rPr>
+                <w:noProof/>
+                <w:webHidden/>
+              </w:rPr>
+            </w:r>
+            <w:r>
+              <w:rPr>
+                <w:noProof/>
+                <w:webHidden/>
+              </w:rPr>
+              <w:fldChar w:fldCharType="separate"/>
+            </w:r>
+            <w:r>
+              <w:rPr>
+                <w:noProof/>
+                <w:webHidden/>
+              </w:rPr>
+              <w:t>16</w:t>
+            </w:r>
+            <w:r>
+              <w:rPr>
+                <w:noProof/>
+                <w:webHidden/>
+              </w:rPr>
+              <w:fldChar w:fldCharType="end"/>
+            </w:r>
+          </w:hyperlink>
+        </w:p>
+        <w:p>
+          <w:pPr>
+            <w:pStyle w:val="TOC1"/>
+            <w:tabs>
+              <w:tab w:val="right" w:leader="dot" w:pos="9016"/>
+            </w:tabs>
+            <w:rPr>
+              <w:rFonts w:eastAsiaTheme="minorEastAsia"/>
+              <w:noProof/>
+              <w:kern w:val="0"/>
+              <w:sz w:val="22"/>
+              <w:szCs w:val="22"/>
+              <w:lang w:val="en-GB" w:eastAsia="en-GB"/>
+              <w14:ligatures w14:val="none"/>
+            </w:rPr>
+          </w:pPr>
+          <w:hyperlink w:anchor="_Toc232065465" w:history="1">
+            <w:r>
+              <w:rPr>
+                <w:rStyle w:val="Hyperlink"/>
+                <w:noProof/>
+              </w:rPr>
+              <w:t>Student Reflection</w:t>
+            </w:r>
+            <w:r>
+              <w:rPr>
+                <w:noProof/>
+                <w:webHidden/>
+              </w:rPr>
+              <w:tab/>
+            </w:r>
+            <w:r>
+              <w:rPr>
+                <w:noProof/>
+                <w:webHidden/>
+              </w:rPr>
+              <w:fldChar w:fldCharType="begin"/>
+            </w:r>
+            <w:r>
+              <w:rPr>
+                <w:noProof/>
+                <w:webHidden/>
+              </w:rPr>
+              <w:instrText xml:space="preserve"> PAGEREF _Toc232065465 \h </w:instrText>
+            </w:r>
+            <w:r>
+              <w:rPr>
+                <w:noProof/>
+                <w:webHidden/>
+              </w:rPr>
+            </w:r>
+            <w:r>
+              <w:rPr>
+                <w:noProof/>
+                <w:webHidden/>
+              </w:rPr>
+              <w:fldChar w:fldCharType="separate"/>
+            </w:r>
+            <w:r>
+              <w:rPr>
+                <w:noProof/>
+                <w:webHidden/>
+              </w:rPr>
+              <w:t>21</w:t>
+            </w:r>
+            <w:r>
+              <w:rPr>
+                <w:noProof/>
+                <w:webHidden/>
+              </w:rPr>
+              <w:fldChar w:fldCharType="end"/>
+            </w:r>
+          </w:hyperlink>
+        </w:p>
+        <w:p>
+          <w:pPr>
+            <w:pStyle w:val="TOC1"/>
+            <w:tabs>
+              <w:tab w:val="right" w:leader="dot" w:pos="9016"/>
+            </w:tabs>
+            <w:rPr>
+              <w:rFonts w:eastAsiaTheme="minorEastAsia"/>
+              <w:noProof/>
+              <w:kern w:val="0"/>
+              <w:sz w:val="22"/>
+              <w:szCs w:val="22"/>
+              <w:lang w:val="en-GB" w:eastAsia="en-GB"/>
+              <w14:ligatures w14:val="none"/>
+            </w:rPr>
+          </w:pPr>
+          <w:hyperlink w:anchor="_Toc232065466" w:history="1">
+            <w:r>
+              <w:rPr>
+                <w:rStyle w:val="Hyperlink"/>
+                <w:noProof/>
+              </w:rPr>
+              <w:t>WEEK 5 Database Components and CRUD Operations</w:t>
+            </w:r>
+            <w:r>
+              <w:rPr>
+                <w:noProof/>
+                <w:webHidden/>
+              </w:rPr>
+              <w:tab/>
+            </w:r>
+            <w:r>
+              <w:rPr>
+                <w:noProof/>
+                <w:webHidden/>
+              </w:rPr>
+              <w:fldChar w:fldCharType="begin"/>
+            </w:r>
+            <w:r>
+              <w:rPr>
+                <w:noProof/>
+                <w:webHidden/>
+              </w:rPr>
+              <w:instrText xml:space="preserve"> PAGEREF _Toc232065466 \h </w:instrText>
+            </w:r>
+            <w:r>
+              <w:rPr>
+                <w:noProof/>
+                <w:webHidden/>
+              </w:rPr>
+            </w:r>
+            <w:r>
+              <w:rPr>
+                <w:noProof/>
+                <w:webHidden/>
+              </w:rPr>
+              <w:fldChar w:fldCharType="separate"/>
+            </w:r>
+            <w:r>
+              <w:rPr>
+                <w:noProof/>
+                <w:webHidden/>
+              </w:rPr>
+              <w:t>22</w:t>
             </w:r>
             <w:r>
               <w:rPr>
@@ -1051,13 +1839,13 @@
               <w14:ligatures w14:val="none"/>
             </w:rPr>
           </w:pPr>
-          <w:hyperlink w:anchor="_Toc232049306" w:history="1">
+          <w:hyperlink w:anchor="_Toc232065467" w:history="1">
             <w:r>
               <w:rPr>
                 <w:rStyle w:val="Hyperlink"/>
                 <w:noProof/>
               </w:rPr>
-              <w:t>Fig 2.2</w:t>
+              <w:t>Hiring and Firing employees is only done by the admin</w:t>
             </w:r>
             <w:r>
               <w:rPr>
@@ -1078,7 +1866,7 @@
                 <w:noProof/>
                 <w:webHidden/>
               </w:rPr>
-              <w:instrText xml:space="preserve"> PAGEREF _Toc232049306 \h </w:instrText>
+              <w:instrText xml:space="preserve"> PAGEREF _Toc232065467 \h </w:instrText>
             </w:r>
             <w:r>
               <w:rPr>
@@ -1098,7 +1886,7 @@
                 <w:noProof/>
                 <w:webHidden/>
               </w:rPr>
-              <w:t>8</w:t>
+              <w:t>22</w:t>
             </w:r>
             <w:r>
               <w:rPr>
@@ -1125,13 +1913,13 @@
               <w14:ligatures w14:val="none"/>
             </w:rPr>
           </w:pPr>
-          <w:hyperlink w:anchor="_Toc232049307" w:history="1">
+          <w:hyperlink w:anchor="_Toc232065468" w:history="1">
             <w:r>
               <w:rPr>
                 <w:rStyle w:val="Hyperlink"/>
                 <w:noProof/>
               </w:rPr>
-              <w:t>Fig 2.3</w:t>
+              <w:t>A clerk can view the products they can sell</w:t>
             </w:r>
             <w:r>
               <w:rPr>
@@ -1152,7 +1940,7 @@
                 <w:noProof/>
                 <w:webHidden/>
               </w:rPr>
-              <w:instrText xml:space="preserve"> PAGEREF _Toc232049307 \h </w:instrText>
+              <w:instrText xml:space="preserve"> PAGEREF _Toc232065468 \h </w:instrText>
             </w:r>
             <w:r>
               <w:rPr>
@@ -1172,7 +1960,7 @@
                 <w:noProof/>
                 <w:webHidden/>
               </w:rPr>
-              <w:t>9</w:t>
+              <w:t>23</w:t>
             </w:r>
             <w:r>
               <w:rPr>
@@ -1199,13 +1987,13 @@
               <w14:ligatures w14:val="none"/>
             </w:rPr>
           </w:pPr>
-          <w:hyperlink w:anchor="_Toc232049308" w:history="1">
+          <w:hyperlink w:anchor="_Toc232065469" w:history="1">
             <w:r>
               <w:rPr>
                 <w:rStyle w:val="Hyperlink"/>
                 <w:noProof/>
               </w:rPr>
-              <w:t>FIG 2.4</w:t>
+              <w:t>An Admin can edit the products within the shop</w:t>
             </w:r>
             <w:r>
               <w:rPr>
@@ -1226,7 +2014,7 @@
                 <w:noProof/>
                 <w:webHidden/>
               </w:rPr>
-              <w:instrText xml:space="preserve"> PAGEREF _Toc232049308 \h </w:instrText>
+              <w:instrText xml:space="preserve"> PAGEREF _Toc232065469 \h </w:instrText>
             </w:r>
             <w:r>
               <w:rPr>
@@ -1246,7 +2034,7 @@
                 <w:noProof/>
                 <w:webHidden/>
               </w:rPr>
-              <w:t>10</w:t>
+              <w:t>24</w:t>
             </w:r>
             <w:r>
               <w:rPr>
@@ -1273,13 +2061,13 @@
               <w14:ligatures w14:val="none"/>
             </w:rPr>
           </w:pPr>
-          <w:hyperlink w:anchor="_Toc232049309" w:history="1">
+          <w:hyperlink w:anchor="_Toc232065470" w:history="1">
             <w:r>
               <w:rPr>
                 <w:rStyle w:val="Hyperlink"/>
                 <w:noProof/>
               </w:rPr>
-              <w:t>WEEK 2 REFLECTION</w:t>
+              <w:t>WEEK 5 REFLECTION</w:t>
             </w:r>
             <w:r>
               <w:rPr>
@@ -1300,7 +2088,7 @@
                 <w:noProof/>
                 <w:webHidden/>
               </w:rPr>
-              <w:instrText xml:space="preserve"> PAGEREF _Toc232049309 \h </w:instrText>
+              <w:instrText xml:space="preserve"> PAGEREF _Toc232065470 \h </w:instrText>
             </w:r>
             <w:r>
               <w:rPr>
@@ -1320,82 +2108,7 @@
                 <w:noProof/>
                 <w:webHidden/>
               </w:rPr>
-              <w:t>11</w:t>
-            </w:r>
-            <w:r>
-              <w:rPr>
-                <w:noProof/>
-                <w:webHidden/>
-              </w:rPr>
-              <w:fldChar w:fldCharType="end"/>
-            </w:r>
-          </w:hyperlink>
-        </w:p>
-        <w:p>
-          <w:pPr>
-            <w:pStyle w:val="TOC2"/>
-            <w:tabs>
-              <w:tab w:val="right" w:leader="dot" w:pos="9016"/>
-            </w:tabs>
-            <w:rPr>
-              <w:rFonts w:eastAsiaTheme="minorEastAsia"/>
-              <w:noProof/>
-              <w:kern w:val="0"/>
-              <w:sz w:val="22"/>
-              <w:szCs w:val="22"/>
-              <w:lang w:val="en-GB" w:eastAsia="en-GB"/>
-              <w14:ligatures w14:val="none"/>
-            </w:rPr>
-          </w:pPr>
-          <w:hyperlink w:anchor="_Toc232049310" w:history="1">
-            <w:r>
-              <w:rPr>
-                <w:rStyle w:val="Hyperlink"/>
-                <w:noProof/>
-                <w:lang w:val="en-GB"/>
-              </w:rPr>
-              <w:t>Project Proposal Summary</w:t>
-            </w:r>
-            <w:r>
-              <w:rPr>
-                <w:noProof/>
-                <w:webHidden/>
-              </w:rPr>
-              <w:tab/>
-            </w:r>
-            <w:r>
-              <w:rPr>
-                <w:noProof/>
-                <w:webHidden/>
-              </w:rPr>
-              <w:fldChar w:fldCharType="begin"/>
-            </w:r>
-            <w:r>
-              <w:rPr>
-                <w:noProof/>
-                <w:webHidden/>
-              </w:rPr>
-              <w:instrText xml:space="preserve"> PAGEREF _Toc232049310 \h </w:instrText>
-            </w:r>
-            <w:r>
-              <w:rPr>
-                <w:noProof/>
-                <w:webHidden/>
-              </w:rPr>
-            </w:r>
-            <w:r>
-              <w:rPr>
-                <w:noProof/>
-                <w:webHidden/>
-              </w:rPr>
-              <w:fldChar w:fldCharType="separate"/>
-            </w:r>
-            <w:r>
-              <w:rPr>
-                <w:noProof/>
-                <w:webHidden/>
-              </w:rPr>
-              <w:t>11</w:t>
+              <w:t>24</w:t>
             </w:r>
             <w:r>
               <w:rPr>
@@ -1459,7 +2172,7 @@
           <w:lang w:val="en-GB"/>
         </w:rPr>
       </w:pPr>
-      <w:bookmarkStart w:id="0" w:name="_Toc232049296"/>
+      <w:bookmarkStart w:id="1" w:name="_Toc232065447"/>
       <w:r>
         <w:rPr>
           <w:lang w:val="en-GB"/>
@@ -1467,7 +2180,7 @@
         <w:lastRenderedPageBreak/>
         <w:t>WEEK 1 CHECKLIST</w:t>
       </w:r>
-      <w:bookmarkEnd w:id="0"/>
+      <w:bookmarkEnd w:id="1"/>
     </w:p>
     <w:p>
       <w:pPr>
@@ -1476,14 +2189,14 @@
           <w:lang w:val="en-GB"/>
         </w:rPr>
       </w:pPr>
-      <w:bookmarkStart w:id="1" w:name="_Toc232049297"/>
+      <w:bookmarkStart w:id="2" w:name="_Toc232065448"/>
       <w:r>
         <w:rPr>
           <w:lang w:val="en-GB"/>
         </w:rPr>
         <w:t>Fig 1.1</w:t>
       </w:r>
-      <w:bookmarkEnd w:id="1"/>
+      <w:bookmarkEnd w:id="2"/>
       <w:r>
         <w:rPr>
           <w:lang w:val="en-GB"/>
@@ -1520,7 +2233,7 @@
           <w14:ligatures w14:val="none"/>
         </w:rPr>
         <w:drawing>
-          <wp:inline distT="0" distB="0" distL="0" distR="0" wp14:anchorId="0B587ED7" wp14:editId="5D06AE82">
+          <wp:inline distT="0" distB="0" distL="0" distR="0" wp14:anchorId="735CAD6D" wp14:editId="457614BA">
             <wp:extent cx="5731510" cy="2494915"/>
             <wp:effectExtent l="0" t="0" r="2540" b="635"/>
             <wp:docPr id="2" name="Picture 2"/>
@@ -1605,14 +2318,14 @@
           <w:lang w:val="en-GB"/>
         </w:rPr>
       </w:pPr>
-      <w:bookmarkStart w:id="2" w:name="_Toc232049298"/>
+      <w:bookmarkStart w:id="3" w:name="_Toc232065449"/>
       <w:r>
         <w:rPr>
           <w:lang w:val="en-GB"/>
         </w:rPr>
         <w:t>Fig 1.2:</w:t>
       </w:r>
-      <w:bookmarkEnd w:id="2"/>
+      <w:bookmarkEnd w:id="3"/>
       <w:r>
         <w:rPr>
           <w:lang w:val="en-GB"/>
@@ -1625,7 +2338,15 @@
         <w:spacing w:afterLines="160" w:after="384"/>
       </w:pPr>
       <w:r>
-        <w:t>Browser accessing http://localhost/phpmyadmin displaying phpMyAdmin dashboard. This confirms MySQL server is running and accessible via web interface.</w:t>
+        <w:t xml:space="preserve">Browser accessing http://localhost/phpmyadmin displaying </w:t>
+      </w:r>
+      <w:proofErr w:type="spellStart"/>
+      <w:r>
+        <w:t>phpMyAdmin</w:t>
+      </w:r>
+      <w:proofErr w:type="spellEnd"/>
+      <w:r>
+        <w:t xml:space="preserve"> dashboard. This confirms MySQL server is running and accessible via web interface.</w:t>
       </w:r>
     </w:p>
     <w:p>
@@ -1641,7 +2362,7 @@
         </w:rPr>
         <w:lastRenderedPageBreak/>
         <w:drawing>
-          <wp:inline distT="0" distB="0" distL="0" distR="0" wp14:anchorId="6461981A" wp14:editId="0F150659">
+          <wp:inline distT="0" distB="0" distL="0" distR="0" wp14:anchorId="5E05ED39" wp14:editId="246A92C1">
             <wp:extent cx="5731510" cy="4424680"/>
             <wp:effectExtent l="0" t="0" r="2540" b="0"/>
             <wp:docPr id="5" name="Picture 5"/>
@@ -1717,11 +2438,11 @@
       <w:pPr>
         <w:pStyle w:val="Heading2"/>
       </w:pPr>
-      <w:bookmarkStart w:id="3" w:name="_Toc232049299"/>
+      <w:bookmarkStart w:id="4" w:name="_Toc232065450"/>
       <w:r>
         <w:t>Fig 1.3</w:t>
       </w:r>
-      <w:bookmarkEnd w:id="3"/>
+      <w:bookmarkEnd w:id="4"/>
     </w:p>
     <w:p>
       <w:r>
@@ -1735,8 +2456,13 @@
       </w:r>
       <w:proofErr w:type="gramStart"/>
       <w:r>
-        <w:t>&lt;?php</w:t>
-      </w:r>
+        <w:t>&lt;?</w:t>
+      </w:r>
+      <w:proofErr w:type="spellStart"/>
+      <w:r>
+        <w:t>php</w:t>
+      </w:r>
+      <w:proofErr w:type="spellEnd"/>
       <w:proofErr w:type="gramEnd"/>
       <w:r>
         <w:t xml:space="preserve"> echo "Hello World</w:t>
@@ -1759,7 +2485,7 @@
           <w14:ligatures w14:val="none"/>
         </w:rPr>
         <w:drawing>
-          <wp:inline distT="0" distB="0" distL="0" distR="0" wp14:anchorId="34A14333" wp14:editId="299BBE37">
+          <wp:inline distT="0" distB="0" distL="0" distR="0" wp14:anchorId="278CB0EF" wp14:editId="5B6C8ADA">
             <wp:extent cx="5731510" cy="1702435"/>
             <wp:effectExtent l="0" t="0" r="2540" b="0"/>
             <wp:docPr id="7" name="Picture 7"/>
@@ -1842,20 +2568,38 @@
       <w:pPr>
         <w:pStyle w:val="Heading2"/>
       </w:pPr>
-      <w:bookmarkStart w:id="4" w:name="_Toc232049300"/>
+      <w:bookmarkStart w:id="5" w:name="_Toc232065451"/>
       <w:r>
         <w:lastRenderedPageBreak/>
         <w:t>Fig 1.4</w:t>
       </w:r>
-      <w:bookmarkEnd w:id="4"/>
-    </w:p>
-    <w:p>
+      <w:bookmarkEnd w:id="5"/>
+    </w:p>
+    <w:p>
+      <w:proofErr w:type="spellStart"/>
       <w:r>
         <w:t>P</w:t>
       </w:r>
       <w:r>
-        <w:t>hpMyAdmin interface showing wan_shoes_db database created with utf8_general_ci collation. The database contains five tables: admins, employees, products, sales, and stock_records</w:t>
-      </w:r>
+        <w:t>hpMyAdmin</w:t>
+      </w:r>
+      <w:proofErr w:type="spellEnd"/>
+      <w:r>
+        <w:t xml:space="preserve"> interface showing </w:t>
+      </w:r>
+      <w:proofErr w:type="spellStart"/>
+      <w:r>
+        <w:t>wan_shoes_db</w:t>
+      </w:r>
+      <w:proofErr w:type="spellEnd"/>
+      <w:r>
+        <w:t xml:space="preserve"> database created with utf8_general_ci collation. The database contains five tables: admins, employees, products, sales, and </w:t>
+      </w:r>
+      <w:proofErr w:type="spellStart"/>
+      <w:r>
+        <w:t>stock_records</w:t>
+      </w:r>
+      <w:proofErr w:type="spellEnd"/>
     </w:p>
     <w:p>
       <w:pPr>
@@ -1868,7 +2612,7 @@
           <w14:ligatures w14:val="none"/>
         </w:rPr>
         <w:drawing>
-          <wp:inline distT="0" distB="0" distL="0" distR="0" wp14:anchorId="56DD10C8" wp14:editId="79D9A976">
+          <wp:inline distT="0" distB="0" distL="0" distR="0" wp14:anchorId="6E17B8B7" wp14:editId="1F16376C">
             <wp:extent cx="5731510" cy="3848100"/>
             <wp:effectExtent l="0" t="0" r="2540" b="0"/>
             <wp:docPr id="9" name="Picture 9"/>
@@ -1936,22 +2680,51 @@
         <w:fldChar w:fldCharType="end"/>
       </w:r>
       <w:r>
-        <w:t xml:space="preserve"> wan_shoes_d</w:t>
-      </w:r>
+        <w:t xml:space="preserve"> </w:t>
+      </w:r>
+      <w:proofErr w:type="spellStart"/>
+      <w:r>
+        <w:t>wan_shoes_d</w:t>
+      </w:r>
+      <w:proofErr w:type="spellEnd"/>
     </w:p>
     <w:p>
       <w:pPr>
         <w:pStyle w:val="Heading2"/>
       </w:pPr>
-      <w:bookmarkStart w:id="5" w:name="_Toc232049301"/>
+      <w:bookmarkStart w:id="6" w:name="_Toc232065452"/>
       <w:r>
         <w:t>Fig 1.5</w:t>
       </w:r>
-      <w:bookmarkEnd w:id="5"/>
-    </w:p>
-    <w:p>
-      <w:r>
-        <w:t>S Code folder structure showing wan_shoes project root with subdirectories: admin/, css/, images/, js/, products/, sales/, stock/, and includes/. This follows professional web development organization standards.</w:t>
+      <w:bookmarkEnd w:id="6"/>
+    </w:p>
+    <w:p>
+      <w:r>
+        <w:t>S Code folder structure showing </w:t>
+      </w:r>
+      <w:proofErr w:type="spellStart"/>
+      <w:r>
+        <w:t>wan_shoes</w:t>
+      </w:r>
+      <w:proofErr w:type="spellEnd"/>
+      <w:r>
+        <w:t xml:space="preserve"> project root with subdirectories: admin/, </w:t>
+      </w:r>
+      <w:proofErr w:type="spellStart"/>
+      <w:r>
+        <w:t>css</w:t>
+      </w:r>
+      <w:proofErr w:type="spellEnd"/>
+      <w:r>
+        <w:t xml:space="preserve">/, images/, </w:t>
+      </w:r>
+      <w:proofErr w:type="spellStart"/>
+      <w:r>
+        <w:t>js</w:t>
+      </w:r>
+      <w:proofErr w:type="spellEnd"/>
+      <w:r>
+        <w:t>/, products/, sales/, stock/, and includes/. This follows professional web development organization standards.</w:t>
       </w:r>
     </w:p>
     <w:p>
@@ -1966,7 +2739,7 @@
         </w:rPr>
         <w:lastRenderedPageBreak/>
         <w:drawing>
-          <wp:inline distT="0" distB="0" distL="0" distR="0" wp14:anchorId="2E4707C8" wp14:editId="76025D7E">
+          <wp:inline distT="0" distB="0" distL="0" distR="0" wp14:anchorId="3258F64A" wp14:editId="19ED365F">
             <wp:extent cx="2301439" cy="3177815"/>
             <wp:effectExtent l="0" t="0" r="3810" b="3810"/>
             <wp:docPr id="10" name="Picture 10"/>
@@ -2041,11 +2814,11 @@
       <w:pPr>
         <w:pStyle w:val="Heading2"/>
       </w:pPr>
-      <w:bookmarkStart w:id="6" w:name="_Toc232049302"/>
+      <w:bookmarkStart w:id="7" w:name="_Toc232065453"/>
       <w:r>
         <w:t>Fig 1.6</w:t>
       </w:r>
-      <w:bookmarkEnd w:id="6"/>
+      <w:bookmarkEnd w:id="7"/>
     </w:p>
     <w:p>
       <w:r>
@@ -2060,7 +2833,7 @@
           <w14:ligatures w14:val="none"/>
         </w:rPr>
         <w:drawing>
-          <wp:inline distT="0" distB="0" distL="0" distR="0" wp14:anchorId="53C9A2CF" wp14:editId="7977B8BC">
+          <wp:inline distT="0" distB="0" distL="0" distR="0" wp14:anchorId="3C4BAAE9" wp14:editId="3DE882AA">
             <wp:extent cx="5731510" cy="3060700"/>
             <wp:effectExtent l="0" t="0" r="2540" b="6350"/>
             <wp:docPr id="11" name="Picture 11"/>
@@ -2128,7 +2901,7 @@
           <w:lang w:val="en-GB"/>
         </w:rPr>
       </w:pPr>
-      <w:bookmarkStart w:id="7" w:name="_Toc232049303"/>
+      <w:bookmarkStart w:id="8" w:name="_Toc232065454"/>
       <w:r>
         <w:rPr>
           <w:lang w:val="en-GB"/>
@@ -2136,14 +2909,38 @@
         <w:lastRenderedPageBreak/>
         <w:t>Week 1 Student Reflection</w:t>
       </w:r>
-      <w:bookmarkEnd w:id="7"/>
+      <w:bookmarkEnd w:id="8"/>
     </w:p>
     <w:p>
       <w:r>
         <w:t xml:space="preserve">I installed XAMPP </w:t>
       </w:r>
       <w:r>
-        <w:t>on Windows 11 to create a local web development environment for the Wan Shoes inventory system. Fig 1.1 shows Apache and MySQL services running without port conflicts, which is essential for PHP processing and database connectivity. Fig 1.3 demonstrates successful PHP execution where a simple echo statement rendered "Hello World" in the browser, confirming the server properly parses PHP code. Fig 1.4 displays wan_shoes_db created in phpMyAdmin with five relational tables: admins, employees, products, sales, and stock_records. The folder structure in Fig 1.5 follows MVC-inspired organization with separate directories for CSS, JavaScript, and feature modules. Finally, Fig 1.6 shows the GitHub repository containing all project code, fulfilling the version control requirement. XAMPP provides a stable foundation for developing the complete inventory management system.</w:t>
+        <w:t>on Windows 11 to create a local web development environment for the Wan Shoes inventory system. Fig 1.1 shows Apache and MySQL services running without port conflicts, which is essential for PHP processing and database connectivity. Fig 1.3 demonstrates successful PHP execution where a simple echo statement rendered "Hello World" in the browser, confirming the server properly parses PHP code. Fig 1.4 displays </w:t>
+      </w:r>
+      <w:proofErr w:type="spellStart"/>
+      <w:r>
+        <w:t>wan_shoes_db</w:t>
+      </w:r>
+      <w:proofErr w:type="spellEnd"/>
+      <w:r>
+        <w:t xml:space="preserve"> created in </w:t>
+      </w:r>
+      <w:proofErr w:type="spellStart"/>
+      <w:r>
+        <w:t>phpMyAdmin</w:t>
+      </w:r>
+      <w:proofErr w:type="spellEnd"/>
+      <w:r>
+        <w:t xml:space="preserve"> with five relational tables: admins, employees, products, sales, and </w:t>
+      </w:r>
+      <w:proofErr w:type="spellStart"/>
+      <w:r>
+        <w:t>stock_records</w:t>
+      </w:r>
+      <w:proofErr w:type="spellEnd"/>
+      <w:r>
+        <w:t>. The folder structure in Fig 1.5 follows MVC-inspired organization with separate directories for CSS, JavaScript, and feature modules. Finally, Fig 1.6 shows the GitHub repository containing all project code, fulfilling the version control requirement. XAMPP provides a stable foundation for developing the complete inventory management system.</w:t>
       </w:r>
     </w:p>
     <w:p/>
@@ -2151,11 +2948,11 @@
       <w:pPr>
         <w:pStyle w:val="Heading1"/>
       </w:pPr>
-      <w:bookmarkStart w:id="8" w:name="_Toc232049304"/>
+      <w:bookmarkStart w:id="9" w:name="_Toc232065455"/>
       <w:r>
         <w:t>WEEK 2</w:t>
       </w:r>
-      <w:bookmarkEnd w:id="8"/>
+      <w:bookmarkEnd w:id="9"/>
       <w:r>
         <w:t xml:space="preserve"> </w:t>
       </w:r>
@@ -2164,11 +2961,11 @@
       <w:pPr>
         <w:pStyle w:val="Heading2"/>
       </w:pPr>
-      <w:bookmarkStart w:id="9" w:name="_Toc232049305"/>
+      <w:bookmarkStart w:id="10" w:name="_Toc232065456"/>
       <w:r>
         <w:t>Fig 2.1</w:t>
       </w:r>
-      <w:bookmarkEnd w:id="9"/>
+      <w:bookmarkEnd w:id="10"/>
     </w:p>
     <w:p>
       <w:r>
@@ -2187,7 +2984,7 @@
         </w:rPr>
         <w:lastRenderedPageBreak/>
         <w:drawing>
-          <wp:inline distT="0" distB="0" distL="0" distR="0" wp14:anchorId="00F706D3" wp14:editId="1FCD9051">
+          <wp:inline distT="0" distB="0" distL="0" distR="0" wp14:anchorId="1BE97B51" wp14:editId="672C97CF">
             <wp:extent cx="3817020" cy="4771486"/>
             <wp:effectExtent l="0" t="0" r="0" b="0"/>
             <wp:docPr id="12" name="Picture 12"/>
@@ -2255,18 +3052,23 @@
         <w:fldChar w:fldCharType="end"/>
       </w:r>
       <w:r>
-        <w:t>Login wirefreame</w:t>
-      </w:r>
+        <w:t xml:space="preserve">Login </w:t>
+      </w:r>
+      <w:proofErr w:type="spellStart"/>
+      <w:r>
+        <w:t>wirefreame</w:t>
+      </w:r>
+      <w:proofErr w:type="spellEnd"/>
     </w:p>
     <w:p>
       <w:pPr>
         <w:pStyle w:val="Heading2"/>
       </w:pPr>
-      <w:bookmarkStart w:id="10" w:name="_Toc232049306"/>
+      <w:bookmarkStart w:id="11" w:name="_Toc232065457"/>
       <w:r>
         <w:t>Fig 2.2</w:t>
       </w:r>
-      <w:bookmarkEnd w:id="10"/>
+      <w:bookmarkEnd w:id="11"/>
     </w:p>
     <w:p>
       <w:r>
@@ -2285,7 +3087,7 @@
         </w:rPr>
         <w:lastRenderedPageBreak/>
         <w:drawing>
-          <wp:inline distT="0" distB="0" distL="0" distR="0" wp14:anchorId="2C2627BA" wp14:editId="4ECEE7AB">
+          <wp:inline distT="0" distB="0" distL="0" distR="0" wp14:anchorId="34C8C1AF" wp14:editId="14BB161E">
             <wp:extent cx="5731510" cy="3940175"/>
             <wp:effectExtent l="0" t="0" r="2540" b="3175"/>
             <wp:docPr id="13" name="Picture 13"/>
@@ -2353,18 +3155,23 @@
         <w:fldChar w:fldCharType="end"/>
       </w:r>
       <w:r>
-        <w:t xml:space="preserve"> Dashboaard</w:t>
-      </w:r>
+        <w:t xml:space="preserve"> </w:t>
+      </w:r>
+      <w:proofErr w:type="spellStart"/>
+      <w:r>
+        <w:t>Dashboaard</w:t>
+      </w:r>
+      <w:proofErr w:type="spellEnd"/>
     </w:p>
     <w:p>
       <w:pPr>
         <w:pStyle w:val="Heading2"/>
       </w:pPr>
-      <w:bookmarkStart w:id="11" w:name="_Toc232049307"/>
+      <w:bookmarkStart w:id="12" w:name="_Toc232065458"/>
       <w:r>
         <w:t>Fig 2.3</w:t>
       </w:r>
-      <w:bookmarkEnd w:id="11"/>
+      <w:bookmarkEnd w:id="12"/>
     </w:p>
     <w:p>
       <w:r>
@@ -2383,7 +3190,7 @@
         </w:rPr>
         <w:lastRenderedPageBreak/>
         <w:drawing>
-          <wp:inline distT="0" distB="0" distL="0" distR="0" wp14:anchorId="729A6C30" wp14:editId="29356686">
+          <wp:inline distT="0" distB="0" distL="0" distR="0" wp14:anchorId="684C3192" wp14:editId="4E16A27A">
             <wp:extent cx="5731510" cy="5015230"/>
             <wp:effectExtent l="0" t="0" r="2540" b="0"/>
             <wp:docPr id="14" name="Picture 14"/>
@@ -2459,11 +3266,11 @@
       <w:pPr>
         <w:pStyle w:val="Heading2"/>
       </w:pPr>
-      <w:bookmarkStart w:id="12" w:name="_Toc232049308"/>
+      <w:bookmarkStart w:id="13" w:name="_Toc232065459"/>
       <w:r>
         <w:t>FIG 2.4</w:t>
       </w:r>
-      <w:bookmarkEnd w:id="12"/>
+      <w:bookmarkEnd w:id="13"/>
     </w:p>
     <w:p>
       <w:pPr>
@@ -2775,11 +3582,11 @@
       <w:pPr>
         <w:pStyle w:val="Heading2"/>
       </w:pPr>
-      <w:bookmarkStart w:id="13" w:name="_Toc232049309"/>
+      <w:bookmarkStart w:id="14" w:name="_Toc232065460"/>
       <w:r>
         <w:t>WEEK 2 REFLECTION</w:t>
       </w:r>
-      <w:bookmarkEnd w:id="13"/>
+      <w:bookmarkEnd w:id="14"/>
     </w:p>
     <w:p>
       <w:r>
@@ -2805,14 +3612,14 @@
           <w:lang w:val="en-GB"/>
         </w:rPr>
       </w:pPr>
-      <w:bookmarkStart w:id="14" w:name="_Toc232049310"/>
+      <w:bookmarkStart w:id="15" w:name="_Toc232065461"/>
       <w:r>
         <w:rPr>
           <w:lang w:val="en-GB"/>
         </w:rPr>
         <w:t>Project Proposal Summary</w:t>
       </w:r>
-      <w:bookmarkEnd w:id="14"/>
+      <w:bookmarkEnd w:id="15"/>
     </w:p>
     <w:p>
       <w:pPr>
@@ -3079,8 +3886,16 @@
         <w:rPr>
           <w:lang w:val="en-GB"/>
         </w:rPr>
-        <w:t> admins, employees, products, sales, stock_records</w:t>
-      </w:r>
+        <w:t xml:space="preserve"> admins, employees, products, sales, </w:t>
+      </w:r>
+      <w:proofErr w:type="spellStart"/>
+      <w:r>
+        <w:rPr>
+          <w:lang w:val="en-GB"/>
+        </w:rPr>
+        <w:t>stock_records</w:t>
+      </w:r>
+      <w:proofErr w:type="spellEnd"/>
     </w:p>
     <w:p>
       <w:pPr>
@@ -3107,18 +3922,27 @@
       <w:pPr>
         <w:pStyle w:val="Heading1"/>
       </w:pPr>
+      <w:bookmarkStart w:id="16" w:name="_Toc232065462"/>
       <w:r>
         <w:lastRenderedPageBreak/>
         <w:t>WEEK 3</w:t>
       </w:r>
+      <w:bookmarkEnd w:id="16"/>
     </w:p>
     <w:p>
       <w:pPr>
         <w:pStyle w:val="Heading2"/>
       </w:pPr>
-      <w:r>
-        <w:t>Javascript and PHP Basics</w:t>
-      </w:r>
+      <w:bookmarkStart w:id="17" w:name="_Toc232065463"/>
+      <w:proofErr w:type="spellStart"/>
+      <w:r>
+        <w:t>Javascript</w:t>
+      </w:r>
+      <w:proofErr w:type="spellEnd"/>
+      <w:r>
+        <w:t xml:space="preserve"> and PHP Basics</w:t>
+      </w:r>
+      <w:bookmarkEnd w:id="17"/>
     </w:p>
     <w:p>
       <w:pPr>
@@ -3126,11 +3950,19 @@
           <w:u w:val="single"/>
         </w:rPr>
       </w:pPr>
+      <w:proofErr w:type="spellStart"/>
       <w:r>
         <w:rPr>
           <w:u w:val="single"/>
         </w:rPr>
-        <w:t>Javascript form validation</w:t>
+        <w:t>Javascript</w:t>
+      </w:r>
+      <w:proofErr w:type="spellEnd"/>
+      <w:r>
+        <w:rPr>
+          <w:u w:val="single"/>
+        </w:rPr>
+        <w:t xml:space="preserve"> form validation</w:t>
       </w:r>
     </w:p>
     <w:p>
@@ -3149,7 +3981,7 @@
           <w14:ligatures w14:val="none"/>
         </w:rPr>
         <w:drawing>
-          <wp:inline distT="0" distB="0" distL="0" distR="0" wp14:anchorId="73C66E77" wp14:editId="1E88C511">
+          <wp:inline distT="0" distB="0" distL="0" distR="0" wp14:anchorId="55640680" wp14:editId="795A30B7">
             <wp:extent cx="4709568" cy="5014395"/>
             <wp:effectExtent l="0" t="0" r="0" b="0"/>
             <wp:docPr id="1" name="Picture 1"/>
@@ -3250,7 +4082,7 @@
         </w:rPr>
         <w:lastRenderedPageBreak/>
         <w:drawing>
-          <wp:inline distT="0" distB="0" distL="0" distR="0" wp14:anchorId="1F905F9F" wp14:editId="00B11375">
+          <wp:inline distT="0" distB="0" distL="0" distR="0" wp14:anchorId="140BE2FB" wp14:editId="270F6C76">
             <wp:extent cx="5731510" cy="2976245"/>
             <wp:effectExtent l="0" t="0" r="2540" b="0"/>
             <wp:docPr id="3" name="Picture 3"/>
@@ -3332,7 +4164,7 @@
           <w14:ligatures w14:val="none"/>
         </w:rPr>
         <w:drawing>
-          <wp:inline distT="0" distB="0" distL="0" distR="0" wp14:anchorId="384A779F" wp14:editId="1BDBEE73">
+          <wp:inline distT="0" distB="0" distL="0" distR="0" wp14:anchorId="15C0A3F7" wp14:editId="1A5EFDF2">
             <wp:extent cx="5731510" cy="2997835"/>
             <wp:effectExtent l="0" t="0" r="2540" b="0"/>
             <wp:docPr id="4" name="Picture 4"/>
@@ -3418,7 +4250,15 @@
     </w:p>
     <w:p>
       <w:r>
-        <w:t>While using javascript I enabled one to be able to see their password while logging in</w:t>
+        <w:t xml:space="preserve">While using </w:t>
+      </w:r>
+      <w:proofErr w:type="spellStart"/>
+      <w:r>
+        <w:t>javascript</w:t>
+      </w:r>
+      <w:proofErr w:type="spellEnd"/>
+      <w:r>
+        <w:t xml:space="preserve"> I enabled one to be able to see their password while logging in</w:t>
       </w:r>
     </w:p>
     <w:p>
@@ -3433,7 +4273,7 @@
         </w:rPr>
         <w:lastRenderedPageBreak/>
         <w:drawing>
-          <wp:inline distT="0" distB="0" distL="0" distR="0" wp14:anchorId="7C93865A" wp14:editId="42962A73">
+          <wp:inline distT="0" distB="0" distL="0" distR="0" wp14:anchorId="4940DDC4" wp14:editId="58889286">
             <wp:extent cx="4922947" cy="5243014"/>
             <wp:effectExtent l="0" t="0" r="0" b="0"/>
             <wp:docPr id="6" name="Picture 6"/>
@@ -3516,7 +4356,7 @@
         </w:rPr>
         <w:lastRenderedPageBreak/>
         <w:drawing>
-          <wp:inline distT="0" distB="0" distL="0" distR="0" wp14:anchorId="49C72A01" wp14:editId="78A3462C">
+          <wp:inline distT="0" distB="0" distL="0" distR="0" wp14:anchorId="0A6A1538" wp14:editId="22BCC675">
             <wp:extent cx="5646909" cy="5997460"/>
             <wp:effectExtent l="0" t="0" r="0" b="3810"/>
             <wp:docPr id="15" name="Picture 15"/>
@@ -3605,9 +4445,14 @@
       <w:r>
         <w:t>Week 3 introduced frontend validation using JavaScript and backend foundations with PHP for the Wan Shoes inventory system. I implemented client-side form validation on the login page using </w:t>
       </w:r>
+      <w:proofErr w:type="spellStart"/>
       <w:proofErr w:type="gramStart"/>
       <w:r>
-        <w:t>validateLogin(</w:t>
+        <w:t>validateLogin</w:t>
+      </w:r>
+      <w:proofErr w:type="spellEnd"/>
+      <w:r>
+        <w:t>(</w:t>
       </w:r>
       <w:proofErr w:type="gramEnd"/>
       <w:r>
@@ -3615,15 +4460,31 @@
       </w:r>
       <w:r>
         <w:lastRenderedPageBreak/>
-        <w:t>using mysqli_</w:t>
+        <w:t>using </w:t>
+      </w:r>
+      <w:proofErr w:type="spellStart"/>
+      <w:r>
+        <w:t>mysqli_</w:t>
       </w:r>
       <w:proofErr w:type="gramStart"/>
       <w:r>
-        <w:t>connect(</w:t>
+        <w:t>connect</w:t>
+      </w:r>
+      <w:proofErr w:type="spellEnd"/>
+      <w:r>
+        <w:t>(</w:t>
       </w:r>
       <w:proofErr w:type="gramEnd"/>
       <w:r>
-        <w:t>"localhost", "root", "", "wan_shoes_db"), successfully connecting to the MySQL database. A password visibility toggle using DOM manipulation was also implemented, allowing users to show/hide passwor</w:t>
+        <w:t>"localhost", "root", "", "</w:t>
+      </w:r>
+      <w:proofErr w:type="spellStart"/>
+      <w:r>
+        <w:t>wan_shoes_db</w:t>
+      </w:r>
+      <w:proofErr w:type="spellEnd"/>
+      <w:r>
+        <w:t>"), successfully connecting to the MySQL database. A password visibility toggle using DOM manipulation was also implemented, allowing users to show/hide passwor</w:t>
       </w:r>
       <w:r>
         <w:t>d text by clicking an eye icon.</w:t>
@@ -3637,12 +4498,14 @@
       <w:pPr>
         <w:pStyle w:val="Heading1"/>
       </w:pPr>
+      <w:bookmarkStart w:id="18" w:name="_Toc232065464"/>
       <w:r>
         <w:t xml:space="preserve">WEEK 4 </w:t>
       </w:r>
       <w:r>
         <w:t>Server Side Components and Backend Development</w:t>
       </w:r>
+      <w:bookmarkEnd w:id="18"/>
     </w:p>
     <w:p>
       <w:r>
@@ -3695,7 +4558,7 @@
           <w14:ligatures w14:val="none"/>
         </w:rPr>
         <w:drawing>
-          <wp:inline distT="0" distB="0" distL="0" distR="0">
+          <wp:inline distT="0" distB="0" distL="0" distR="0" wp14:anchorId="3F164A6D" wp14:editId="5531FBDB">
             <wp:extent cx="4610500" cy="5090601"/>
             <wp:effectExtent l="0" t="0" r="0" b="0"/>
             <wp:docPr id="16" name="Picture 16"/>
@@ -3752,7 +4615,7 @@
         </w:rPr>
         <w:lastRenderedPageBreak/>
         <w:drawing>
-          <wp:inline distT="0" distB="0" distL="0" distR="0">
+          <wp:inline distT="0" distB="0" distL="0" distR="0" wp14:anchorId="7997EC9A" wp14:editId="545CCD4D">
             <wp:extent cx="5731510" cy="4825365"/>
             <wp:effectExtent l="0" t="0" r="2540" b="0"/>
             <wp:docPr id="17" name="Picture 17"/>
@@ -3829,7 +4692,7 @@
         </w:rPr>
         <w:lastRenderedPageBreak/>
         <w:drawing>
-          <wp:inline distT="0" distB="0" distL="0" distR="0">
+          <wp:inline distT="0" distB="0" distL="0" distR="0" wp14:anchorId="073CD878" wp14:editId="444930BC">
             <wp:extent cx="4686706" cy="5044877"/>
             <wp:effectExtent l="0" t="0" r="0" b="3810"/>
             <wp:docPr id="18" name="Picture 18"/>
@@ -3885,7 +4748,7 @@
           <w14:ligatures w14:val="none"/>
         </w:rPr>
         <w:drawing>
-          <wp:inline distT="0" distB="0" distL="0" distR="0">
+          <wp:inline distT="0" distB="0" distL="0" distR="0" wp14:anchorId="46DF7E87" wp14:editId="0705DFE8">
             <wp:extent cx="5731510" cy="2705735"/>
             <wp:effectExtent l="0" t="0" r="2540" b="0"/>
             <wp:docPr id="19" name="Picture 19"/>
@@ -3955,7 +4818,7 @@
         </w:rPr>
         <w:lastRenderedPageBreak/>
         <w:drawing>
-          <wp:inline distT="0" distB="0" distL="0" distR="0">
+          <wp:inline distT="0" distB="0" distL="0" distR="0" wp14:anchorId="076B791D" wp14:editId="4111F8FE">
             <wp:extent cx="5090601" cy="5692633"/>
             <wp:effectExtent l="0" t="0" r="0" b="3810"/>
             <wp:docPr id="20" name="Picture 20"/>
@@ -4011,7 +4874,7 @@
           <w14:ligatures w14:val="none"/>
         </w:rPr>
         <w:drawing>
-          <wp:inline distT="0" distB="0" distL="0" distR="0">
+          <wp:inline distT="0" distB="0" distL="0" distR="0" wp14:anchorId="698A0F99" wp14:editId="70854CED">
             <wp:extent cx="5731510" cy="2392680"/>
             <wp:effectExtent l="0" t="0" r="2540" b="7620"/>
             <wp:docPr id="21" name="Picture 21"/>
@@ -4053,48 +4916,439 @@
         </w:drawing>
       </w:r>
     </w:p>
+    <w:p>
+      <w:pPr>
+        <w:rPr>
+          <w:u w:val="single"/>
+        </w:rPr>
+      </w:pPr>
+    </w:p>
+    <w:p>
+      <w:pPr>
+        <w:spacing w:line="259" w:lineRule="auto"/>
+        <w:rPr>
+          <w:u w:val="single"/>
+        </w:rPr>
+      </w:pPr>
+      <w:r>
+        <w:rPr>
+          <w:u w:val="single"/>
+        </w:rPr>
+        <w:lastRenderedPageBreak/>
+        <w:t>Clerk Dashboard showing record sale</w:t>
+      </w:r>
+    </w:p>
+    <w:p>
+      <w:pPr>
+        <w:spacing w:line="259" w:lineRule="auto"/>
+        <w:rPr>
+          <w:u w:val="single"/>
+        </w:rPr>
+      </w:pPr>
+      <w:r>
+        <w:rPr>
+          <w:noProof/>
+          <w:u w:val="single"/>
+          <w:lang w:val="en-GB" w:eastAsia="en-GB"/>
+          <w14:ligatures w14:val="none"/>
+        </w:rPr>
+        <w:drawing>
+          <wp:inline distT="0" distB="0" distL="0" distR="0" wp14:anchorId="44E512F6" wp14:editId="231552BE">
+            <wp:extent cx="5731510" cy="4957445"/>
+            <wp:effectExtent l="0" t="0" r="2540" b="0"/>
+            <wp:docPr id="22" name="Picture 22"/>
+            <wp:cNvGraphicFramePr>
+              <a:graphicFrameLocks xmlns:a="http://schemas.openxmlformats.org/drawingml/2006/main" noChangeAspect="1"/>
+            </wp:cNvGraphicFramePr>
+            <a:graphic xmlns:a="http://schemas.openxmlformats.org/drawingml/2006/main">
+              <a:graphicData uri="http://schemas.openxmlformats.org/drawingml/2006/picture">
+                <pic:pic xmlns:pic="http://schemas.openxmlformats.org/drawingml/2006/picture">
+                  <pic:nvPicPr>
+                    <pic:cNvPr id="22" name="Screenshot 2026-06-11 095948.png"/>
+                    <pic:cNvPicPr/>
+                  </pic:nvPicPr>
+                  <pic:blipFill>
+                    <a:blip r:embed="rId28">
+                      <a:extLst>
+                        <a:ext uri="{28A0092B-C50C-407E-A947-70E740481C1C}">
+                          <a14:useLocalDpi xmlns:a14="http://schemas.microsoft.com/office/drawing/2010/main" val="0"/>
+                        </a:ext>
+                      </a:extLst>
+                    </a:blip>
+                    <a:stretch>
+                      <a:fillRect/>
+                    </a:stretch>
+                  </pic:blipFill>
+                  <pic:spPr>
+                    <a:xfrm>
+                      <a:off x="0" y="0"/>
+                      <a:ext cx="5731510" cy="4957445"/>
+                    </a:xfrm>
+                    <a:prstGeom prst="rect">
+                      <a:avLst/>
+                    </a:prstGeom>
+                  </pic:spPr>
+                </pic:pic>
+              </a:graphicData>
+            </a:graphic>
+          </wp:inline>
+        </w:drawing>
+      </w:r>
+      <w:r>
+        <w:rPr>
+          <w:u w:val="single"/>
+        </w:rPr>
+        <w:br w:type="page"/>
+      </w:r>
+    </w:p>
+    <w:p>
+      <w:pPr>
+        <w:rPr>
+          <w:u w:val="single"/>
+        </w:rPr>
+      </w:pPr>
+    </w:p>
     <w:p/>
     <w:p>
       <w:pPr>
         <w:pStyle w:val="Heading1"/>
       </w:pPr>
+      <w:bookmarkStart w:id="19" w:name="_Toc232065465"/>
+      <w:r>
+        <w:t>Student Reflection</w:t>
+      </w:r>
+      <w:bookmarkEnd w:id="19"/>
+    </w:p>
+    <w:p>
+      <w:r>
+        <w:t>Week 4 focused on server-side authentication and session management for the Wan Shoes inventory system. I implemented a role-based login system that authenticates users against the admins and employees tables using </w:t>
+      </w:r>
+      <w:proofErr w:type="spellStart"/>
+      <w:r>
+        <w:t>mysqli_</w:t>
+      </w:r>
+      <w:proofErr w:type="gramStart"/>
+      <w:r>
+        <w:t>query</w:t>
+      </w:r>
+      <w:proofErr w:type="spellEnd"/>
+      <w:r>
+        <w:t>(</w:t>
+      </w:r>
+      <w:proofErr w:type="gramEnd"/>
+      <w:r>
+        <w:t xml:space="preserve">), then establishes sessions storing </w:t>
+      </w:r>
+      <w:proofErr w:type="spellStart"/>
+      <w:r>
+        <w:t>user_id</w:t>
+      </w:r>
+      <w:proofErr w:type="spellEnd"/>
+      <w:r>
+        <w:t>, name, and role. The admin dashboard displays dynamic statistics calculated via SQL aggregate functions including </w:t>
+      </w:r>
+      <w:proofErr w:type="gramStart"/>
+      <w:r>
+        <w:t>SUM(</w:t>
+      </w:r>
+      <w:proofErr w:type="spellStart"/>
+      <w:proofErr w:type="gramEnd"/>
+      <w:r>
+        <w:t>stock_quantity</w:t>
+      </w:r>
+      <w:proofErr w:type="spellEnd"/>
+      <w:r>
+        <w:t xml:space="preserve"> * price) for inventory valuation showing total stock worth in KSH, and COUNT(*) for products and staff totals. Role-based redirection sends admins to </w:t>
+      </w:r>
+      <w:proofErr w:type="spellStart"/>
+      <w:r>
+        <w:t>admin.php</w:t>
+      </w:r>
+      <w:proofErr w:type="spellEnd"/>
+      <w:r>
+        <w:t xml:space="preserve"> while employees go to </w:t>
+      </w:r>
+      <w:proofErr w:type="spellStart"/>
+      <w:r>
+        <w:t>dashboard.php</w:t>
+      </w:r>
+      <w:proofErr w:type="spellEnd"/>
+      <w:r>
+        <w:t>, where menu options differ for clerks (sales recording) versus stock managers (inventory addition). Session validation using </w:t>
+      </w:r>
+      <w:proofErr w:type="spellStart"/>
+      <w:r>
+        <w:t>isset</w:t>
+      </w:r>
+      <w:proofErr w:type="spellEnd"/>
+      <w:r>
+        <w:t xml:space="preserve">($_SESSION['role']) is applied to all restricted pages, redirecting unauthenticated users to </w:t>
+      </w:r>
+      <w:proofErr w:type="spellStart"/>
+      <w:r>
+        <w:t>login.php</w:t>
+      </w:r>
+      <w:proofErr w:type="spellEnd"/>
+      <w:r>
+        <w:t>. Logout functionality destroys sessions using </w:t>
+      </w:r>
+      <w:proofErr w:type="spellStart"/>
+      <w:r>
+        <w:t>session_</w:t>
+      </w:r>
+      <w:proofErr w:type="gramStart"/>
+      <w:r>
+        <w:t>destroy</w:t>
+      </w:r>
+      <w:proofErr w:type="spellEnd"/>
+      <w:r>
+        <w:t>(</w:t>
+      </w:r>
+      <w:proofErr w:type="gramEnd"/>
+      <w:r>
+        <w:t>). The folder structure maintains separation of concerns with CSS, JavaScript, and PHP controllers organized logically, demonstrating professional web development practices.</w:t>
+      </w:r>
+    </w:p>
+    <w:p/>
+    <w:p>
+      <w:pPr>
+        <w:pStyle w:val="Heading1"/>
+      </w:pPr>
+      <w:bookmarkStart w:id="20" w:name="_Toc232065466"/>
       <w:r>
         <w:lastRenderedPageBreak/>
-        <w:t>Student Reflection</w:t>
-      </w:r>
-    </w:p>
-    <w:p>
-      <w:r>
-        <w:t>Week 4 focused on server-side authentication and session management for the Wan Shoes inventory system. I implemented a role-based login system that authenticates users against the admins and employees tables using mysqli_</w:t>
+        <w:t>WEEK 5 Database Components and CRUD Operations</w:t>
+      </w:r>
+      <w:bookmarkEnd w:id="20"/>
+    </w:p>
+    <w:p>
+      <w:pPr>
+        <w:pStyle w:val="Heading2"/>
+      </w:pPr>
+      <w:bookmarkStart w:id="21" w:name="_Toc232065467"/>
+      <w:r>
+        <w:t xml:space="preserve">Hiring and Firing </w:t>
+      </w:r>
+      <w:r>
+        <w:t>employees is only done by the admin</w:t>
+      </w:r>
+      <w:bookmarkEnd w:id="21"/>
+    </w:p>
+    <w:p>
+      <w:r>
+        <w:rPr>
+          <w:noProof/>
+          <w:lang w:val="en-GB" w:eastAsia="en-GB"/>
+          <w14:ligatures w14:val="none"/>
+        </w:rPr>
+        <w:drawing>
+          <wp:inline distT="0" distB="0" distL="0" distR="0" wp14:anchorId="041401AB" wp14:editId="0E90AAE8">
+            <wp:extent cx="5731510" cy="5572125"/>
+            <wp:effectExtent l="0" t="0" r="2540" b="9525"/>
+            <wp:docPr id="23" name="Picture 23"/>
+            <wp:cNvGraphicFramePr>
+              <a:graphicFrameLocks xmlns:a="http://schemas.openxmlformats.org/drawingml/2006/main" noChangeAspect="1"/>
+            </wp:cNvGraphicFramePr>
+            <a:graphic xmlns:a="http://schemas.openxmlformats.org/drawingml/2006/main">
+              <a:graphicData uri="http://schemas.openxmlformats.org/drawingml/2006/picture">
+                <pic:pic xmlns:pic="http://schemas.openxmlformats.org/drawingml/2006/picture">
+                  <pic:nvPicPr>
+                    <pic:cNvPr id="23" name="Screenshot 2026-06-11 101143.png"/>
+                    <pic:cNvPicPr/>
+                  </pic:nvPicPr>
+                  <pic:blipFill>
+                    <a:blip r:embed="rId29">
+                      <a:extLst>
+                        <a:ext uri="{28A0092B-C50C-407E-A947-70E740481C1C}">
+                          <a14:useLocalDpi xmlns:a14="http://schemas.microsoft.com/office/drawing/2010/main" val="0"/>
+                        </a:ext>
+                      </a:extLst>
+                    </a:blip>
+                    <a:stretch>
+                      <a:fillRect/>
+                    </a:stretch>
+                  </pic:blipFill>
+                  <pic:spPr>
+                    <a:xfrm>
+                      <a:off x="0" y="0"/>
+                      <a:ext cx="5731510" cy="5572125"/>
+                    </a:xfrm>
+                    <a:prstGeom prst="rect">
+                      <a:avLst/>
+                    </a:prstGeom>
+                  </pic:spPr>
+                </pic:pic>
+              </a:graphicData>
+            </a:graphic>
+          </wp:inline>
+        </w:drawing>
+      </w:r>
+    </w:p>
+    <w:p/>
+    <w:p/>
+    <w:p>
+      <w:r>
+        <w:rPr>
+          <w:rStyle w:val="Heading2Char"/>
+        </w:rPr>
+        <w:lastRenderedPageBreak/>
+        <w:t xml:space="preserve"> </w:t>
+      </w:r>
+      <w:bookmarkStart w:id="22" w:name="_Toc232065468"/>
+      <w:r>
+        <w:rPr>
+          <w:rStyle w:val="Heading2Char"/>
+        </w:rPr>
+        <w:t>A clerk can view the products they can sell</w:t>
+      </w:r>
+      <w:bookmarkEnd w:id="22"/>
+      <w:r>
+        <w:rPr>
+          <w:noProof/>
+          <w:lang w:val="en-GB" w:eastAsia="en-GB"/>
+          <w14:ligatures w14:val="none"/>
+        </w:rPr>
+        <w:drawing>
+          <wp:inline distT="0" distB="0" distL="0" distR="0" wp14:anchorId="5EF93915" wp14:editId="1A0FBA51">
+            <wp:extent cx="5731510" cy="3642360"/>
+            <wp:effectExtent l="0" t="0" r="2540" b="0"/>
+            <wp:docPr id="24" name="Picture 24"/>
+            <wp:cNvGraphicFramePr>
+              <a:graphicFrameLocks xmlns:a="http://schemas.openxmlformats.org/drawingml/2006/main" noChangeAspect="1"/>
+            </wp:cNvGraphicFramePr>
+            <a:graphic xmlns:a="http://schemas.openxmlformats.org/drawingml/2006/main">
+              <a:graphicData uri="http://schemas.openxmlformats.org/drawingml/2006/picture">
+                <pic:pic xmlns:pic="http://schemas.openxmlformats.org/drawingml/2006/picture">
+                  <pic:nvPicPr>
+                    <pic:cNvPr id="24" name="Screenshot 2026-06-11 101033.png"/>
+                    <pic:cNvPicPr/>
+                  </pic:nvPicPr>
+                  <pic:blipFill>
+                    <a:blip r:embed="rId30">
+                      <a:extLst>
+                        <a:ext uri="{28A0092B-C50C-407E-A947-70E740481C1C}">
+                          <a14:useLocalDpi xmlns:a14="http://schemas.microsoft.com/office/drawing/2010/main" val="0"/>
+                        </a:ext>
+                      </a:extLst>
+                    </a:blip>
+                    <a:stretch>
+                      <a:fillRect/>
+                    </a:stretch>
+                  </pic:blipFill>
+                  <pic:spPr>
+                    <a:xfrm>
+                      <a:off x="0" y="0"/>
+                      <a:ext cx="5731510" cy="3642360"/>
+                    </a:xfrm>
+                    <a:prstGeom prst="rect">
+                      <a:avLst/>
+                    </a:prstGeom>
+                  </pic:spPr>
+                </pic:pic>
+              </a:graphicData>
+            </a:graphic>
+          </wp:inline>
+        </w:drawing>
+      </w:r>
+    </w:p>
+    <w:p/>
+    <w:p>
+      <w:pPr>
+        <w:pStyle w:val="Heading2"/>
+      </w:pPr>
+      <w:bookmarkStart w:id="23" w:name="_Toc232065469"/>
+      <w:r>
+        <w:lastRenderedPageBreak/>
+        <w:t>An Admin can edit the products within the shop</w:t>
+      </w:r>
+      <w:bookmarkEnd w:id="23"/>
+    </w:p>
+    <w:p>
+      <w:r>
+        <w:rPr>
+          <w:noProof/>
+          <w:lang w:val="en-GB" w:eastAsia="en-GB"/>
+          <w14:ligatures w14:val="none"/>
+        </w:rPr>
+        <w:drawing>
+          <wp:inline distT="0" distB="0" distL="0" distR="0" wp14:anchorId="686B672D" wp14:editId="7B621A90">
+            <wp:extent cx="5731510" cy="6063615"/>
+            <wp:effectExtent l="0" t="0" r="2540" b="0"/>
+            <wp:docPr id="25" name="Picture 25"/>
+            <wp:cNvGraphicFramePr>
+              <a:graphicFrameLocks xmlns:a="http://schemas.openxmlformats.org/drawingml/2006/main" noChangeAspect="1"/>
+            </wp:cNvGraphicFramePr>
+            <a:graphic xmlns:a="http://schemas.openxmlformats.org/drawingml/2006/main">
+              <a:graphicData uri="http://schemas.openxmlformats.org/drawingml/2006/picture">
+                <pic:pic xmlns:pic="http://schemas.openxmlformats.org/drawingml/2006/picture">
+                  <pic:nvPicPr>
+                    <pic:cNvPr id="25" name="Screenshot 2026-06-11 100707.png"/>
+                    <pic:cNvPicPr/>
+                  </pic:nvPicPr>
+                  <pic:blipFill>
+                    <a:blip r:embed="rId31">
+                      <a:extLst>
+                        <a:ext uri="{28A0092B-C50C-407E-A947-70E740481C1C}">
+                          <a14:useLocalDpi xmlns:a14="http://schemas.microsoft.com/office/drawing/2010/main" val="0"/>
+                        </a:ext>
+                      </a:extLst>
+                    </a:blip>
+                    <a:stretch>
+                      <a:fillRect/>
+                    </a:stretch>
+                  </pic:blipFill>
+                  <pic:spPr>
+                    <a:xfrm>
+                      <a:off x="0" y="0"/>
+                      <a:ext cx="5731510" cy="6063615"/>
+                    </a:xfrm>
+                    <a:prstGeom prst="rect">
+                      <a:avLst/>
+                    </a:prstGeom>
+                  </pic:spPr>
+                </pic:pic>
+              </a:graphicData>
+            </a:graphic>
+          </wp:inline>
+        </w:drawing>
+      </w:r>
+    </w:p>
+    <w:p/>
+    <w:p>
+      <w:pPr>
+        <w:pStyle w:val="Heading2"/>
+      </w:pPr>
+      <w:bookmarkStart w:id="24" w:name="_Toc232065470"/>
+      <w:r>
+        <w:t>WEEK 5 REFLECTION</w:t>
+      </w:r>
+      <w:bookmarkEnd w:id="24"/>
+    </w:p>
+    <w:p>
+      <w:r>
+        <w:t xml:space="preserve">Week 5 completed the database-driven inventory system with full CRUD (Create, Read, Update, Delete) operations for the Wan Shoes platform. The products page allows admin to add new shoes with name, brand, size, price, and stock quantity, edit existing product details, and delete products — while clerks and stock managers have view-only access. Employee management enables admin to hire new staff with role selection (clerk or stock manager) and fire employees with a confirmation dialog. The sales recording page for clerks validates stock availability using a SELECT query before inserting into the sales table and updating the products table to deduct quantity. Stock managers can add inventory, updating </w:t>
+      </w:r>
+      <w:r>
+        <w:lastRenderedPageBreak/>
+        <w:t xml:space="preserve">product quantities and logging additions to </w:t>
+      </w:r>
+      <w:proofErr w:type="spellStart"/>
+      <w:r>
+        <w:t>stock_records</w:t>
+      </w:r>
+      <w:proofErr w:type="spellEnd"/>
+      <w:r>
+        <w:t xml:space="preserve"> for auditing. The admin sales report uses LEFT JOIN queries to display transaction details with clerk names, product names, and calculates total revenue using </w:t>
       </w:r>
       <w:proofErr w:type="gramStart"/>
       <w:r>
-        <w:t>query(</w:t>
+        <w:t>SUM(</w:t>
       </w:r>
       <w:proofErr w:type="gramEnd"/>
       <w:r>
-        <w:t>), then establishes sessions storing user_id, name, and role. The admin dashboard displays dynamic statistics calculated via SQL aggregate functions including </w:t>
-      </w:r>
-      <w:proofErr w:type="gramStart"/>
-      <w:r>
-        <w:t>SUM(</w:t>
-      </w:r>
-      <w:proofErr w:type="gramEnd"/>
-      <w:r>
-        <w:t>stock_quantity * price) for inventory valuation showing total stock worth in KSH, and COUNT(*) for products and staff totals. Role-based redirection sends admins to admin.php while employees go to dashboard.php, where menu options differ for clerks (sales recording) versus stock managers (inventory addition). Session validation using isset($_SESSION['role']) is applied to all restricted pages, redirecting unauthenticated users to login.php. Logout functionality destroys sessions using session_</w:t>
-      </w:r>
-      <w:proofErr w:type="gramStart"/>
-      <w:r>
-        <w:t>destroy(</w:t>
-      </w:r>
-      <w:proofErr w:type="gramEnd"/>
-      <w:r>
-        <w:t>). The folder structure maintains separation of concerns with CSS, JavaScript, and PHP controllers organized logically, demonstrating professional web development practices.</w:t>
-      </w:r>
-      <w:bookmarkStart w:id="15" w:name="_GoBack"/>
-      <w:bookmarkEnd w:id="15"/>
-    </w:p>
-    <w:p/>
+        <w:t>) aggregation. All forms include JavaScript validation and the employee hire form includes a real-time password strength checker enforcing minimum 8-character passwords. The system is fully functional with all assignment requirements met.</w:t>
+      </w:r>
+    </w:p>
     <w:sectPr>
       <w:pgSz w:w="11906" w:h="16838"/>
       <w:pgMar w:top="1440" w:right="1440" w:bottom="1440" w:left="1440" w:header="708" w:footer="708" w:gutter="0"/>
@@ -5129,7 +6383,7 @@
 </file>
 
 <file path=customXml/itemProps1.xml><?xml version="1.0" encoding="utf-8"?>
-<ds:datastoreItem xmlns:ds="http://schemas.openxmlformats.org/officeDocument/2006/customXml" ds:itemID="{0E4B3231-0F7E-4DAB-8801-AAA49AC4DA0D}">
+<ds:datastoreItem xmlns:ds="http://schemas.openxmlformats.org/officeDocument/2006/customXml" ds:itemID="{8132CAA4-B19C-4A6B-872A-93E29E2947AD}">
   <ds:schemaRefs>
     <ds:schemaRef ds:uri="http://schemas.openxmlformats.org/officeDocument/2006/bibliography"/>
   </ds:schemaRefs>

</xml_diff>